<commit_message>
docs: insert Sprint 3-2 (issues #16-24) into project plan; renumber old 3-2 to 3-3
New Sprint 3-2 (Month 13 Wk 3-4, 38 pts): UAT bug fixes and UI polish
covering all 9 open issues — aircraft rotation (#17), stdout noise (#18),
satellite image persistence (#19), export menu items (#20), panel resize
(#21), satellite scale match (#16), panel layout persistence (#22),
panel re-open via View menu (#23), custom clearance rules (#24).

Former Sprint 3-2 (commercial tier) renumbered to Sprint 3-3 with
adjusted dates (Month 14, Wk 1-4). Story IDs updated 3-2-x → 3-3-x.
Velocity table and Phase 3 summary updated (3 sprints, 116 pts; total
Phases 0-3: 20 sprints, 827 pts).

Co-Authored-By: Claude Sonnet 4.6 <noreply@anthropic.com>
</commit_message>
<xml_diff>
--- a/docs/ARLD_Project_Plan_v1.0.docx
+++ b/docs/ARLD_Project_Plan_v1.0.docx
@@ -43076,6 +43076,2301 @@
         </w:tc>
       </w:tr>
     </w:tbl>
+    <w:tbl>
+      <w:tblPr>
+        <w:tblW w:type="dxa" w:w="12960"/>
+        <w:tblBorders>
+          <w:top w:val="single" w:color="auto" w:sz="4"/>
+          <w:left w:val="single" w:color="auto" w:sz="4"/>
+          <w:bottom w:val="single" w:color="auto" w:sz="4"/>
+          <w:right w:val="single" w:color="auto" w:sz="4"/>
+          <w:insideH w:val="single" w:color="auto" w:sz="4"/>
+          <w:insideV w:val="single" w:color="auto" w:sz="4"/>
+        </w:tblBorders>
+      </w:tblPr>
+      <w:tblGrid>
+        <w:gridCol w:w="4800"/>
+        <w:gridCol w:w="2400"/>
+        <w:gridCol w:w="1600"/>
+        <w:gridCol w:w="4160"/>
+      </w:tblGrid>
+      <w:tr>
+        <w:tc>
+          <w:tcPr>
+            <w:tcW w:type="dxa" w:w="4800"/>
+            <w:tcBorders>
+              <w:top w:val="single" w:color="5B3A8A" w:sz="1"/>
+              <w:left w:val="single" w:color="5B3A8A" w:sz="1"/>
+              <w:bottom w:val="single" w:color="5B3A8A" w:sz="1"/>
+              <w:right w:val="single" w:color="5B3A8A" w:sz="1"/>
+            </w:tcBorders>
+            <w:shd w:fill="EDE8F5" w:val="clear"/>
+            <w:tcMar>
+              <w:top w:type="dxa" w:w="100"/>
+              <w:left w:type="dxa" w:w="180"/>
+              <w:bottom w:type="dxa" w:w="100"/>
+              <w:right w:type="dxa" w:w="120"/>
+            </w:tcMar>
+          </w:tcPr>
+          <w:p>
+            <w:r>
+              <w:rPr>
+                <w:rFonts w:ascii="Arial" w:cs="Arial" w:eastAsia="Arial" w:hAnsi="Arial"/>
+                <w:b/>
+                <w:bCs/>
+                <w:color w:val="5B3A8A"/>
+                <w:sz w:val="24"/>
+                <w:szCs w:val="24"/>
+              </w:rPr>
+              <w:t xml:space="preserve">Sprint 3-2</w:t>
+            </w:r>
+          </w:p>
+        </w:tc>
+        <w:tc>
+          <w:tcPr>
+            <w:tcW w:type="dxa" w:w="2400"/>
+            <w:tcBorders>
+              <w:top w:val="single" w:color="5B3A8A" w:sz="1"/>
+              <w:left w:val="single" w:color="5B3A8A" w:sz="1"/>
+              <w:bottom w:val="single" w:color="5B3A8A" w:sz="1"/>
+              <w:right w:val="single" w:color="5B3A8A" w:sz="1"/>
+            </w:tcBorders>
+            <w:shd w:fill="EDE8F5" w:val="clear"/>
+            <w:tcMar>
+              <w:top w:type="dxa" w:w="100"/>
+              <w:left w:type="dxa" w:w="120"/>
+              <w:bottom w:type="dxa" w:w="100"/>
+              <w:right w:type="dxa" w:w="120"/>
+            </w:tcMar>
+          </w:tcPr>
+          <w:p>
+            <w:pPr>
+              <w:spacing w:after="20" w:before="0"/>
+            </w:pPr>
+            <w:r>
+              <w:rPr>
+                <w:rFonts w:ascii="Arial" w:cs="Arial" w:eastAsia="Arial" w:hAnsi="Arial"/>
+                <w:b/>
+                <w:bCs/>
+                <w:color w:val="5B3A8A"/>
+                <w:sz w:val="18"/>
+                <w:szCs w:val="18"/>
+              </w:rPr>
+              <w:t xml:space="preserve">Dates</w:t>
+            </w:r>
+          </w:p>
+          <w:p>
+            <w:pPr>
+              <w:spacing w:after="0" w:before="0"/>
+            </w:pPr>
+            <w:r>
+              <w:rPr>
+                <w:rFonts w:ascii="Arial" w:cs="Arial" w:eastAsia="Arial" w:hAnsi="Arial"/>
+                <w:sz w:val="18"/>
+                <w:szCs w:val="18"/>
+              </w:rPr>
+              <w:t xml:space="preserve">Month 13, Wk 3–4</w:t>
+            </w:r>
+          </w:p>
+        </w:tc>
+        <w:tc>
+          <w:tcPr>
+            <w:tcW w:type="dxa" w:w="1600"/>
+            <w:tcBorders>
+              <w:top w:val="single" w:color="5B3A8A" w:sz="1"/>
+              <w:left w:val="single" w:color="5B3A8A" w:sz="1"/>
+              <w:bottom w:val="single" w:color="5B3A8A" w:sz="1"/>
+              <w:right w:val="single" w:color="5B3A8A" w:sz="1"/>
+            </w:tcBorders>
+            <w:shd w:fill="EDE8F5" w:val="clear"/>
+            <w:tcMar>
+              <w:top w:type="dxa" w:w="100"/>
+              <w:left w:type="dxa" w:w="120"/>
+              <w:bottom w:type="dxa" w:w="100"/>
+              <w:right w:type="dxa" w:w="120"/>
+            </w:tcMar>
+          </w:tcPr>
+          <w:p>
+            <w:pPr>
+              <w:spacing w:after="20" w:before="0"/>
+            </w:pPr>
+            <w:r>
+              <w:rPr>
+                <w:rFonts w:ascii="Arial" w:cs="Arial" w:eastAsia="Arial" w:hAnsi="Arial"/>
+                <w:b/>
+                <w:bCs/>
+                <w:color w:val="5B3A8A"/>
+                <w:sz w:val="18"/>
+                <w:szCs w:val="18"/>
+              </w:rPr>
+              <w:t xml:space="preserve">Points</w:t>
+            </w:r>
+          </w:p>
+          <w:p>
+            <w:pPr>
+              <w:spacing w:after="0" w:before="0"/>
+              <w:jc w:val="center"/>
+            </w:pPr>
+            <w:r>
+              <w:rPr>
+                <w:rFonts w:ascii="Arial" w:cs="Arial" w:eastAsia="Arial" w:hAnsi="Arial"/>
+                <w:b/>
+                <w:bCs/>
+                <w:color w:val="5B3A8A"/>
+                <w:sz w:val="22"/>
+                <w:szCs w:val="22"/>
+              </w:rPr>
+              <w:t xml:space="preserve">38</w:t>
+            </w:r>
+          </w:p>
+        </w:tc>
+        <w:tc>
+          <w:tcPr>
+            <w:tcW w:type="dxa" w:w="4160"/>
+            <w:tcBorders>
+              <w:top w:val="single" w:color="5B3A8A" w:sz="1"/>
+              <w:left w:val="single" w:color="5B3A8A" w:sz="1"/>
+              <w:bottom w:val="single" w:color="5B3A8A" w:sz="1"/>
+              <w:right w:val="single" w:color="5B3A8A" w:sz="1"/>
+            </w:tcBorders>
+            <w:shd w:fill="EDE8F5" w:val="clear"/>
+            <w:tcMar>
+              <w:top w:type="dxa" w:w="100"/>
+              <w:left w:type="dxa" w:w="120"/>
+              <w:bottom w:type="dxa" w:w="100"/>
+              <w:right w:type="dxa" w:w="120"/>
+            </w:tcMar>
+          </w:tcPr>
+          <w:p>
+            <w:r>
+              <w:rPr>
+                <w:rFonts w:ascii="Arial" w:cs="Arial" w:eastAsia="Arial" w:hAnsi="Arial"/>
+                <w:b/>
+                <w:bCs/>
+                <w:color w:val="5B3A8A"/>
+                <w:sz w:val="18"/>
+                <w:szCs w:val="18"/>
+              </w:rPr>
+              <w:t xml:space="preserve">Sprint Goal:  </w:t>
+            </w:r>
+            <w:r>
+              <w:rPr>
+                <w:rFonts w:ascii="Arial" w:cs="Arial" w:eastAsia="Arial" w:hAnsi="Arial"/>
+                <w:sz w:val="18"/>
+                <w:szCs w:val="18"/>
+              </w:rPr>
+              <w:t xml:space="preserve">UAT bug fixes and UI polish: aircraft rotation (#17), stdout noise (#18), satellite image persistence (#19), export menu items (#20), panel resize (#21), satellite scale match (#16), panel layout persistence (#22), panel re-open via View menu (#23), custom clearance rules (#24)</w:t>
+            </w:r>
+          </w:p>
+        </w:tc>
+      </w:tr>
+    </w:tbl>
+    <w:p>
+      <w:pPr>
+        <w:spacing w:after="80" w:before="0"/>
+      </w:pPr>
+      <w:r>
+        <w:rPr>
+          <w:rFonts w:ascii="Arial" w:cs="Arial" w:eastAsia="Arial" w:hAnsi="Arial"/>
+        </w:rPr>
+        <w:t xml:space="preserve"/>
+      </w:r>
+    </w:p>
+    <w:tbl>
+      <w:tblPr>
+        <w:tblW w:type="dxa" w:w="12960"/>
+        <w:tblBorders>
+          <w:top w:val="single" w:color="auto" w:sz="4"/>
+          <w:left w:val="single" w:color="auto" w:sz="4"/>
+          <w:bottom w:val="single" w:color="auto" w:sz="4"/>
+          <w:right w:val="single" w:color="auto" w:sz="4"/>
+          <w:insideH w:val="single" w:color="auto" w:sz="4"/>
+          <w:insideV w:val="single" w:color="auto" w:sz="4"/>
+        </w:tblBorders>
+      </w:tblPr>
+      <w:tblGrid>
+        <w:gridCol w:w="1000"/>
+        <w:gridCol w:w="3600"/>
+        <w:gridCol w:w="1560"/>
+        <w:gridCol w:w="1400"/>
+        <w:gridCol w:w="700"/>
+        <w:gridCol w:w="4700"/>
+      </w:tblGrid>
+      <w:tr>
+        <w:trPr>
+          <w:tblHeader/>
+        </w:trPr>
+        <w:tc>
+          <w:tcPr>
+            <w:tcW w:type="dxa" w:w="1000"/>
+            <w:tcBorders>
+              <w:top w:val="single" w:color="1B2A4A" w:sz="1"/>
+              <w:left w:val="single" w:color="1B2A4A" w:sz="1"/>
+              <w:bottom w:val="single" w:color="1B2A4A" w:sz="1"/>
+              <w:right w:val="single" w:color="1B2A4A" w:sz="1"/>
+            </w:tcBorders>
+            <w:shd w:fill="1B2A4A" w:val="clear"/>
+            <w:tcMar>
+              <w:top w:type="dxa" w:w="80"/>
+              <w:left w:type="dxa" w:w="100"/>
+              <w:bottom w:type="dxa" w:w="80"/>
+              <w:right w:type="dxa" w:w="80"/>
+            </w:tcMar>
+          </w:tcPr>
+          <w:p>
+            <w:r>
+              <w:rPr>
+                <w:rFonts w:ascii="Arial" w:cs="Arial" w:eastAsia="Arial" w:hAnsi="Arial"/>
+                <w:b/>
+                <w:bCs/>
+                <w:color w:val="FFFFFF"/>
+                <w:sz w:val="18"/>
+                <w:szCs w:val="18"/>
+              </w:rPr>
+              <w:t xml:space="preserve">#</w:t>
+            </w:r>
+          </w:p>
+        </w:tc>
+        <w:tc>
+          <w:tcPr>
+            <w:tcW w:type="dxa" w:w="3600"/>
+            <w:tcBorders>
+              <w:top w:val="single" w:color="1B2A4A" w:sz="1"/>
+              <w:left w:val="single" w:color="1B2A4A" w:sz="1"/>
+              <w:bottom w:val="single" w:color="1B2A4A" w:sz="1"/>
+              <w:right w:val="single" w:color="1B2A4A" w:sz="1"/>
+            </w:tcBorders>
+            <w:shd w:fill="1B2A4A" w:val="clear"/>
+            <w:tcMar>
+              <w:top w:type="dxa" w:w="80"/>
+              <w:left w:type="dxa" w:w="100"/>
+              <w:bottom w:type="dxa" w:w="80"/>
+              <w:right w:type="dxa" w:w="80"/>
+            </w:tcMar>
+          </w:tcPr>
+          <w:p>
+            <w:r>
+              <w:rPr>
+                <w:rFonts w:ascii="Arial" w:cs="Arial" w:eastAsia="Arial" w:hAnsi="Arial"/>
+                <w:b/>
+                <w:bCs/>
+                <w:color w:val="FFFFFF"/>
+                <w:sz w:val="18"/>
+                <w:szCs w:val="18"/>
+              </w:rPr>
+              <w:t xml:space="preserve">User Story / Task</w:t>
+            </w:r>
+          </w:p>
+        </w:tc>
+        <w:tc>
+          <w:tcPr>
+            <w:tcW w:type="dxa" w:w="1560"/>
+            <w:tcBorders>
+              <w:top w:val="single" w:color="1B2A4A" w:sz="1"/>
+              <w:left w:val="single" w:color="1B2A4A" w:sz="1"/>
+              <w:bottom w:val="single" w:color="1B2A4A" w:sz="1"/>
+              <w:right w:val="single" w:color="1B2A4A" w:sz="1"/>
+            </w:tcBorders>
+            <w:shd w:fill="1B2A4A" w:val="clear"/>
+            <w:tcMar>
+              <w:top w:type="dxa" w:w="80"/>
+              <w:left w:type="dxa" w:w="100"/>
+              <w:bottom w:type="dxa" w:w="80"/>
+              <w:right w:type="dxa" w:w="80"/>
+            </w:tcMar>
+          </w:tcPr>
+          <w:p>
+            <w:r>
+              <w:rPr>
+                <w:rFonts w:ascii="Arial" w:cs="Arial" w:eastAsia="Arial" w:hAnsi="Arial"/>
+                <w:b/>
+                <w:bCs/>
+                <w:color w:val="FFFFFF"/>
+                <w:sz w:val="18"/>
+                <w:szCs w:val="18"/>
+              </w:rPr>
+              <w:t xml:space="preserve">FRD / TRD Refs</w:t>
+            </w:r>
+          </w:p>
+        </w:tc>
+        <w:tc>
+          <w:tcPr>
+            <w:tcW w:type="dxa" w:w="1400"/>
+            <w:tcBorders>
+              <w:top w:val="single" w:color="1B2A4A" w:sz="1"/>
+              <w:left w:val="single" w:color="1B2A4A" w:sz="1"/>
+              <w:bottom w:val="single" w:color="1B2A4A" w:sz="1"/>
+              <w:right w:val="single" w:color="1B2A4A" w:sz="1"/>
+            </w:tcBorders>
+            <w:shd w:fill="1B2A4A" w:val="clear"/>
+            <w:tcMar>
+              <w:top w:type="dxa" w:w="80"/>
+              <w:left w:type="dxa" w:w="100"/>
+              <w:bottom w:type="dxa" w:w="80"/>
+              <w:right w:type="dxa" w:w="80"/>
+            </w:tcMar>
+          </w:tcPr>
+          <w:p>
+            <w:r>
+              <w:rPr>
+                <w:rFonts w:ascii="Arial" w:cs="Arial" w:eastAsia="Arial" w:hAnsi="Arial"/>
+                <w:b/>
+                <w:bCs/>
+                <w:color w:val="FFFFFF"/>
+                <w:sz w:val="18"/>
+                <w:szCs w:val="18"/>
+              </w:rPr>
+              <w:t xml:space="preserve">Owner(s)</w:t>
+            </w:r>
+          </w:p>
+        </w:tc>
+        <w:tc>
+          <w:tcPr>
+            <w:tcW w:type="dxa" w:w="700"/>
+            <w:tcBorders>
+              <w:top w:val="single" w:color="1B2A4A" w:sz="1"/>
+              <w:left w:val="single" w:color="1B2A4A" w:sz="1"/>
+              <w:bottom w:val="single" w:color="1B2A4A" w:sz="1"/>
+              <w:right w:val="single" w:color="1B2A4A" w:sz="1"/>
+            </w:tcBorders>
+            <w:shd w:fill="1B2A4A" w:val="clear"/>
+            <w:tcMar>
+              <w:top w:type="dxa" w:w="80"/>
+              <w:left w:type="dxa" w:w="100"/>
+              <w:bottom w:type="dxa" w:w="80"/>
+              <w:right w:type="dxa" w:w="80"/>
+            </w:tcMar>
+          </w:tcPr>
+          <w:p>
+            <w:r>
+              <w:rPr>
+                <w:rFonts w:ascii="Arial" w:cs="Arial" w:eastAsia="Arial" w:hAnsi="Arial"/>
+                <w:b/>
+                <w:bCs/>
+                <w:color w:val="FFFFFF"/>
+                <w:sz w:val="18"/>
+                <w:szCs w:val="18"/>
+              </w:rPr>
+              <w:t xml:space="preserve">Points</w:t>
+            </w:r>
+          </w:p>
+        </w:tc>
+        <w:tc>
+          <w:tcPr>
+            <w:tcW w:type="dxa" w:w="4700"/>
+            <w:tcBorders>
+              <w:top w:val="single" w:color="1B2A4A" w:sz="1"/>
+              <w:left w:val="single" w:color="1B2A4A" w:sz="1"/>
+              <w:bottom w:val="single" w:color="1B2A4A" w:sz="1"/>
+              <w:right w:val="single" w:color="1B2A4A" w:sz="1"/>
+            </w:tcBorders>
+            <w:shd w:fill="1B2A4A" w:val="clear"/>
+            <w:tcMar>
+              <w:top w:type="dxa" w:w="80"/>
+              <w:left w:type="dxa" w:w="100"/>
+              <w:bottom w:type="dxa" w:w="80"/>
+              <w:right w:type="dxa" w:w="80"/>
+            </w:tcMar>
+          </w:tcPr>
+          <w:p>
+            <w:r>
+              <w:rPr>
+                <w:rFonts w:ascii="Arial" w:cs="Arial" w:eastAsia="Arial" w:hAnsi="Arial"/>
+                <w:b/>
+                <w:bCs/>
+                <w:color w:val="FFFFFF"/>
+                <w:sz w:val="18"/>
+                <w:szCs w:val="18"/>
+              </w:rPr>
+              <w:t xml:space="preserve">Acceptance Criteria</w:t>
+            </w:r>
+          </w:p>
+        </w:tc>
+      </w:tr>
+      <w:tr>
+        <w:tc>
+          <w:tcPr>
+            <w:tcW w:type="dxa" w:w="1000"/>
+            <w:tcBorders>
+              <w:top w:val="single" w:color="C8CDD6" w:sz="1"/>
+              <w:left w:val="single" w:color="C8CDD6" w:sz="1"/>
+              <w:bottom w:val="single" w:color="C8CDD6" w:sz="1"/>
+              <w:right w:val="single" w:color="C8CDD6" w:sz="1"/>
+            </w:tcBorders>
+            <w:shd w:fill="FFFFFF" w:val="clear"/>
+            <w:tcMar>
+              <w:top w:type="dxa" w:w="70"/>
+              <w:left w:type="dxa" w:w="100"/>
+              <w:bottom w:type="dxa" w:w="70"/>
+              <w:right w:type="dxa" w:w="80"/>
+            </w:tcMar>
+            <w:vAlign w:val="center"/>
+          </w:tcPr>
+          <w:p>
+            <w:pPr>
+              <w:jc w:val="center"/>
+            </w:pPr>
+            <w:r>
+              <w:rPr>
+                <w:rFonts w:ascii="Arial" w:cs="Arial" w:eastAsia="Arial" w:hAnsi="Arial"/>
+                <w:b/>
+                <w:bCs/>
+                <w:color w:val="1B2A4A"/>
+                <w:sz w:val="17"/>
+                <w:szCs w:val="17"/>
+              </w:rPr>
+              <w:t xml:space="preserve">3-2-1</w:t>
+            </w:r>
+          </w:p>
+        </w:tc>
+        <w:tc>
+          <w:tcPr>
+            <w:tcW w:type="dxa" w:w="3600"/>
+            <w:tcBorders>
+              <w:top w:val="single" w:color="C8CDD6" w:sz="1"/>
+              <w:left w:val="single" w:color="C8CDD6" w:sz="1"/>
+              <w:bottom w:val="single" w:color="C8CDD6" w:sz="1"/>
+              <w:right w:val="single" w:color="C8CDD6" w:sz="1"/>
+            </w:tcBorders>
+            <w:shd w:fill="FFFFFF" w:val="clear"/>
+            <w:tcMar>
+              <w:top w:type="dxa" w:w="70"/>
+              <w:left w:type="dxa" w:w="100"/>
+              <w:bottom w:type="dxa" w:w="70"/>
+              <w:right w:type="dxa" w:w="80"/>
+            </w:tcMar>
+          </w:tcPr>
+          <w:p>
+            <w:pPr>
+              <w:jc w:val="left"/>
+            </w:pPr>
+            <w:r>
+              <w:rPr>
+                <w:rFonts w:ascii="Arial" w:cs="Arial" w:eastAsia="Arial" w:hAnsi="Arial"/>
+                <w:b w:val="false"/>
+                <w:bCs w:val="false"/>
+                <w:color w:val="3C3C3C"/>
+                <w:sz w:val="18"/>
+                <w:szCs w:val="18"/>
+              </w:rPr>
+              <w:t xml:space="preserve">Fix aircraft rotation handle: rotation must begin immediately on drag; Shift enables 1° fine mode only (issue #17)</w:t>
+            </w:r>
+          </w:p>
+        </w:tc>
+        <w:tc>
+          <w:tcPr>
+            <w:tcW w:type="dxa" w:w="1560"/>
+            <w:tcBorders>
+              <w:top w:val="single" w:color="C8CDD6" w:sz="1"/>
+              <w:left w:val="single" w:color="C8CDD6" w:sz="1"/>
+              <w:bottom w:val="single" w:color="C8CDD6" w:sz="1"/>
+              <w:right w:val="single" w:color="C8CDD6" w:sz="1"/>
+            </w:tcBorders>
+            <w:shd w:fill="FFFFFF" w:val="clear"/>
+            <w:tcMar>
+              <w:top w:type="dxa" w:w="70"/>
+              <w:left w:type="dxa" w:w="80"/>
+              <w:bottom w:type="dxa" w:w="70"/>
+              <w:right w:type="dxa" w:w="80"/>
+            </w:tcMar>
+          </w:tcPr>
+          <w:p>
+            <w:pPr>
+              <w:jc w:val="left"/>
+            </w:pPr>
+            <w:r>
+              <w:rPr>
+                <w:rFonts w:ascii="Arial" w:cs="Arial" w:eastAsia="Arial" w:hAnsi="Arial"/>
+                <w:b w:val="false"/>
+                <w:bCs w:val="false"/>
+                <w:color w:val="3C3C3C"/>
+                <w:sz w:val="18"/>
+                <w:szCs w:val="18"/>
+              </w:rPr>
+              <w:t xml:space="preserve">TRD-UI-012 / FRD CTRL-008</w:t>
+            </w:r>
+          </w:p>
+        </w:tc>
+        <w:tc>
+          <w:tcPr>
+            <w:tcW w:type="dxa" w:w="1400"/>
+            <w:tcBorders>
+              <w:top w:val="single" w:color="C8CDD6" w:sz="1"/>
+              <w:left w:val="single" w:color="C8CDD6" w:sz="1"/>
+              <w:bottom w:val="single" w:color="C8CDD6" w:sz="1"/>
+              <w:right w:val="single" w:color="C8CDD6" w:sz="1"/>
+            </w:tcBorders>
+            <w:shd w:fill="FFFFFF" w:val="clear"/>
+            <w:tcMar>
+              <w:top w:type="dxa" w:w="70"/>
+              <w:left w:type="dxa" w:w="100"/>
+              <w:bottom w:type="dxa" w:w="70"/>
+              <w:right w:type="dxa" w:w="80"/>
+            </w:tcMar>
+          </w:tcPr>
+          <w:p>
+            <w:pPr>
+              <w:jc w:val="left"/>
+            </w:pPr>
+            <w:r>
+              <w:rPr>
+                <w:rFonts w:ascii="Arial" w:cs="Arial" w:eastAsia="Arial" w:hAnsi="Arial"/>
+                <w:b w:val="false"/>
+                <w:bCs w:val="false"/>
+                <w:color w:val="3C3C3C"/>
+                <w:sz w:val="18"/>
+                <w:szCs w:val="18"/>
+              </w:rPr>
+              <w:t xml:space="preserve">Lead C++ Eng</w:t>
+            </w:r>
+          </w:p>
+        </w:tc>
+        <w:tc>
+          <w:tcPr>
+            <w:tcW w:type="dxa" w:w="700"/>
+            <w:tcBorders>
+              <w:top w:val="single" w:color="C8CDD6" w:sz="1"/>
+              <w:left w:val="single" w:color="C8CDD6" w:sz="1"/>
+              <w:bottom w:val="single" w:color="C8CDD6" w:sz="1"/>
+              <w:right w:val="single" w:color="C8CDD6" w:sz="1"/>
+            </w:tcBorders>
+            <w:shd w:fill="FFF3CD" w:val="clear"/>
+            <w:tcMar>
+              <w:top w:type="dxa" w:w="70"/>
+              <w:left w:type="dxa" w:w="100"/>
+              <w:bottom w:type="dxa" w:w="70"/>
+              <w:right w:type="dxa" w:w="80"/>
+            </w:tcMar>
+            <w:vAlign w:val="center"/>
+          </w:tcPr>
+          <w:p>
+            <w:pPr>
+              <w:jc w:val="center"/>
+            </w:pPr>
+            <w:r>
+              <w:rPr>
+                <w:rFonts w:ascii="Arial" w:cs="Arial" w:eastAsia="Arial" w:hAnsi="Arial"/>
+                <w:b w:val="false"/>
+                <w:bCs w:val="false"/>
+                <w:color w:val="3C3C3C"/>
+                <w:sz w:val="18"/>
+                <w:szCs w:val="18"/>
+              </w:rPr>
+              <w:t xml:space="preserve">3</w:t>
+            </w:r>
+          </w:p>
+        </w:tc>
+        <w:tc>
+          <w:tcPr>
+            <w:tcW w:type="dxa" w:w="4700"/>
+            <w:tcBorders>
+              <w:top w:val="single" w:color="C8CDD6" w:sz="1"/>
+              <w:left w:val="single" w:color="C8CDD6" w:sz="1"/>
+              <w:bottom w:val="single" w:color="C8CDD6" w:sz="1"/>
+              <w:right w:val="single" w:color="C8CDD6" w:sz="1"/>
+            </w:tcBorders>
+            <w:shd w:fill="FFFFFF" w:val="clear"/>
+            <w:tcMar>
+              <w:top w:type="dxa" w:w="70"/>
+              <w:left w:type="dxa" w:w="100"/>
+              <w:bottom w:type="dxa" w:w="70"/>
+              <w:right w:type="dxa" w:w="80"/>
+            </w:tcMar>
+          </w:tcPr>
+          <w:p>
+            <w:pPr>
+              <w:jc w:val="left"/>
+            </w:pPr>
+            <w:r>
+              <w:rPr>
+                <w:rFonts w:ascii="Arial" w:cs="Arial" w:eastAsia="Arial" w:hAnsi="Arial"/>
+                <w:b w:val="false"/>
+                <w:bCs w:val="false"/>
+                <w:color w:val="3C3C3C"/>
+                <w:sz w:val="18"/>
+                <w:szCs w:val="18"/>
+              </w:rPr>
+              <w:t xml:space="preserve">Rotation starts on first drag pixel with no Shift required; Shift still engages 1° precision; 45° snap preserved in normal mode</w:t>
+            </w:r>
+          </w:p>
+        </w:tc>
+      </w:tr>
+      <w:tr>
+        <w:tc>
+          <w:tcPr>
+            <w:tcW w:type="dxa" w:w="1000"/>
+            <w:tcBorders>
+              <w:top w:val="single" w:color="C8CDD6" w:sz="1"/>
+              <w:left w:val="single" w:color="C8CDD6" w:sz="1"/>
+              <w:bottom w:val="single" w:color="C8CDD6" w:sz="1"/>
+              <w:right w:val="single" w:color="C8CDD6" w:sz="1"/>
+            </w:tcBorders>
+            <w:shd w:fill="F2F4F7" w:val="clear"/>
+            <w:tcMar>
+              <w:top w:type="dxa" w:w="70"/>
+              <w:left w:type="dxa" w:w="100"/>
+              <w:bottom w:type="dxa" w:w="70"/>
+              <w:right w:type="dxa" w:w="80"/>
+            </w:tcMar>
+            <w:vAlign w:val="center"/>
+          </w:tcPr>
+          <w:p>
+            <w:pPr>
+              <w:jc w:val="center"/>
+            </w:pPr>
+            <w:r>
+              <w:rPr>
+                <w:rFonts w:ascii="Arial" w:cs="Arial" w:eastAsia="Arial" w:hAnsi="Arial"/>
+                <w:b/>
+                <w:bCs/>
+                <w:color w:val="1B2A4A"/>
+                <w:sz w:val="17"/>
+                <w:szCs w:val="17"/>
+              </w:rPr>
+              <w:t xml:space="preserve">3-2-2</w:t>
+            </w:r>
+          </w:p>
+        </w:tc>
+        <w:tc>
+          <w:tcPr>
+            <w:tcW w:type="dxa" w:w="3600"/>
+            <w:tcBorders>
+              <w:top w:val="single" w:color="C8CDD6" w:sz="1"/>
+              <w:left w:val="single" w:color="C8CDD6" w:sz="1"/>
+              <w:bottom w:val="single" w:color="C8CDD6" w:sz="1"/>
+              <w:right w:val="single" w:color="C8CDD6" w:sz="1"/>
+            </w:tcBorders>
+            <w:shd w:fill="F2F4F7" w:val="clear"/>
+            <w:tcMar>
+              <w:top w:type="dxa" w:w="70"/>
+              <w:left w:type="dxa" w:w="100"/>
+              <w:bottom w:type="dxa" w:w="70"/>
+              <w:right w:type="dxa" w:w="80"/>
+            </w:tcMar>
+          </w:tcPr>
+          <w:p>
+            <w:pPr>
+              <w:jc w:val="left"/>
+            </w:pPr>
+            <w:r>
+              <w:rPr>
+                <w:rFonts w:ascii="Arial" w:cs="Arial" w:eastAsia="Arial" w:hAnsi="Arial"/>
+                <w:b w:val="false"/>
+                <w:bCs w:val="false"/>
+                <w:color w:val="3C3C3C"/>
+                <w:sz w:val="18"/>
+                <w:szCs w:val="18"/>
+              </w:rPr>
+              <w:t xml:space="preserve">Suppress spurious QTableView::setSpan messages printed to stdout whenever any dialog is open (issue #18)</w:t>
+            </w:r>
+          </w:p>
+        </w:tc>
+        <w:tc>
+          <w:tcPr>
+            <w:tcW w:type="dxa" w:w="1560"/>
+            <w:tcBorders>
+              <w:top w:val="single" w:color="C8CDD6" w:sz="1"/>
+              <w:left w:val="single" w:color="C8CDD6" w:sz="1"/>
+              <w:bottom w:val="single" w:color="C8CDD6" w:sz="1"/>
+              <w:right w:val="single" w:color="C8CDD6" w:sz="1"/>
+            </w:tcBorders>
+            <w:shd w:fill="F2F4F7" w:val="clear"/>
+            <w:tcMar>
+              <w:top w:type="dxa" w:w="70"/>
+              <w:left w:type="dxa" w:w="80"/>
+              <w:bottom w:type="dxa" w:w="70"/>
+              <w:right w:type="dxa" w:w="80"/>
+            </w:tcMar>
+          </w:tcPr>
+          <w:p>
+            <w:pPr>
+              <w:jc w:val="left"/>
+            </w:pPr>
+            <w:r>
+              <w:rPr>
+                <w:rFonts w:ascii="Arial" w:cs="Arial" w:eastAsia="Arial" w:hAnsi="Arial"/>
+                <w:b w:val="false"/>
+                <w:bCs w:val="false"/>
+                <w:color w:val="3C3C3C"/>
+                <w:sz w:val="18"/>
+                <w:szCs w:val="18"/>
+              </w:rPr>
+              <w:t xml:space="preserve">TRD-UI-015</w:t>
+            </w:r>
+          </w:p>
+        </w:tc>
+        <w:tc>
+          <w:tcPr>
+            <w:tcW w:type="dxa" w:w="1400"/>
+            <w:tcBorders>
+              <w:top w:val="single" w:color="C8CDD6" w:sz="1"/>
+              <w:left w:val="single" w:color="C8CDD6" w:sz="1"/>
+              <w:bottom w:val="single" w:color="C8CDD6" w:sz="1"/>
+              <w:right w:val="single" w:color="C8CDD6" w:sz="1"/>
+            </w:tcBorders>
+            <w:shd w:fill="F2F4F7" w:val="clear"/>
+            <w:tcMar>
+              <w:top w:type="dxa" w:w="70"/>
+              <w:left w:type="dxa" w:w="100"/>
+              <w:bottom w:type="dxa" w:w="70"/>
+              <w:right w:type="dxa" w:w="80"/>
+            </w:tcMar>
+          </w:tcPr>
+          <w:p>
+            <w:pPr>
+              <w:jc w:val="left"/>
+            </w:pPr>
+            <w:r>
+              <w:rPr>
+                <w:rFonts w:ascii="Arial" w:cs="Arial" w:eastAsia="Arial" w:hAnsi="Arial"/>
+                <w:b w:val="false"/>
+                <w:bCs w:val="false"/>
+                <w:color w:val="3C3C3C"/>
+                <w:sz w:val="18"/>
+                <w:szCs w:val="18"/>
+              </w:rPr>
+              <w:t xml:space="preserve">C++ Eng #2</w:t>
+            </w:r>
+          </w:p>
+        </w:tc>
+        <w:tc>
+          <w:tcPr>
+            <w:tcW w:type="dxa" w:w="700"/>
+            <w:tcBorders>
+              <w:top w:val="single" w:color="C8CDD6" w:sz="1"/>
+              <w:left w:val="single" w:color="C8CDD6" w:sz="1"/>
+              <w:bottom w:val="single" w:color="C8CDD6" w:sz="1"/>
+              <w:right w:val="single" w:color="C8CDD6" w:sz="1"/>
+            </w:tcBorders>
+            <w:shd w:fill="D5F5D5" w:val="clear"/>
+            <w:tcMar>
+              <w:top w:type="dxa" w:w="70"/>
+              <w:left w:type="dxa" w:w="100"/>
+              <w:bottom w:type="dxa" w:w="70"/>
+              <w:right w:type="dxa" w:w="80"/>
+            </w:tcMar>
+            <w:vAlign w:val="center"/>
+          </w:tcPr>
+          <w:p>
+            <w:pPr>
+              <w:jc w:val="center"/>
+            </w:pPr>
+            <w:r>
+              <w:rPr>
+                <w:rFonts w:ascii="Arial" w:cs="Arial" w:eastAsia="Arial" w:hAnsi="Arial"/>
+                <w:b w:val="false"/>
+                <w:bCs w:val="false"/>
+                <w:color w:val="3C3C3C"/>
+                <w:sz w:val="18"/>
+                <w:szCs w:val="18"/>
+              </w:rPr>
+              <w:t xml:space="preserve">3</w:t>
+            </w:r>
+          </w:p>
+        </w:tc>
+        <w:tc>
+          <w:tcPr>
+            <w:tcW w:type="dxa" w:w="4700"/>
+            <w:tcBorders>
+              <w:top w:val="single" w:color="C8CDD6" w:sz="1"/>
+              <w:left w:val="single" w:color="C8CDD6" w:sz="1"/>
+              <w:bottom w:val="single" w:color="C8CDD6" w:sz="1"/>
+              <w:right w:val="single" w:color="C8CDD6" w:sz="1"/>
+            </w:tcBorders>
+            <w:shd w:fill="F2F4F7" w:val="clear"/>
+            <w:tcMar>
+              <w:top w:type="dxa" w:w="70"/>
+              <w:left w:type="dxa" w:w="100"/>
+              <w:bottom w:type="dxa" w:w="70"/>
+              <w:right w:type="dxa" w:w="80"/>
+            </w:tcMar>
+          </w:tcPr>
+          <w:p>
+            <w:pPr>
+              <w:jc w:val="left"/>
+            </w:pPr>
+            <w:r>
+              <w:rPr>
+                <w:rFonts w:ascii="Arial" w:cs="Arial" w:eastAsia="Arial" w:hAnsi="Arial"/>
+                <w:b w:val="false"/>
+                <w:bCs w:val="false"/>
+                <w:color w:val="3C3C3C"/>
+                <w:sz w:val="18"/>
+                <w:szCs w:val="18"/>
+              </w:rPr>
+              <w:t xml:space="preserve">No QTableView::setSpan output on stdout during normal use; stderr clean on macOS, Linux, and Windows</w:t>
+            </w:r>
+          </w:p>
+        </w:tc>
+      </w:tr>
+      <w:tr>
+        <w:tc>
+          <w:tcPr>
+            <w:tcW w:type="dxa" w:w="1000"/>
+            <w:tcBorders>
+              <w:top w:val="single" w:color="C8CDD6" w:sz="1"/>
+              <w:left w:val="single" w:color="C8CDD6" w:sz="1"/>
+              <w:bottom w:val="single" w:color="C8CDD6" w:sz="1"/>
+              <w:right w:val="single" w:color="C8CDD6" w:sz="1"/>
+            </w:tcBorders>
+            <w:shd w:fill="FFFFFF" w:val="clear"/>
+            <w:tcMar>
+              <w:top w:type="dxa" w:w="70"/>
+              <w:left w:type="dxa" w:w="100"/>
+              <w:bottom w:type="dxa" w:w="70"/>
+              <w:right w:type="dxa" w:w="80"/>
+            </w:tcMar>
+            <w:vAlign w:val="center"/>
+          </w:tcPr>
+          <w:p>
+            <w:pPr>
+              <w:jc w:val="center"/>
+            </w:pPr>
+            <w:r>
+              <w:rPr>
+                <w:rFonts w:ascii="Arial" w:cs="Arial" w:eastAsia="Arial" w:hAnsi="Arial"/>
+                <w:b/>
+                <w:bCs/>
+                <w:color w:val="1B2A4A"/>
+                <w:sz w:val="17"/>
+                <w:szCs w:val="17"/>
+              </w:rPr>
+              <w:t xml:space="preserve">3-2-3</w:t>
+            </w:r>
+          </w:p>
+        </w:tc>
+        <w:tc>
+          <w:tcPr>
+            <w:tcW w:type="dxa" w:w="3600"/>
+            <w:tcBorders>
+              <w:top w:val="single" w:color="C8CDD6" w:sz="1"/>
+              <w:left w:val="single" w:color="C8CDD6" w:sz="1"/>
+              <w:bottom w:val="single" w:color="C8CDD6" w:sz="1"/>
+              <w:right w:val="single" w:color="C8CDD6" w:sz="1"/>
+            </w:tcBorders>
+            <w:shd w:fill="FFFFFF" w:val="clear"/>
+            <w:tcMar>
+              <w:top w:type="dxa" w:w="70"/>
+              <w:left w:type="dxa" w:w="100"/>
+              <w:bottom w:type="dxa" w:w="70"/>
+              <w:right w:type="dxa" w:w="80"/>
+            </w:tcMar>
+          </w:tcPr>
+          <w:p>
+            <w:pPr>
+              <w:jc w:val="left"/>
+            </w:pPr>
+            <w:r>
+              <w:rPr>
+                <w:rFonts w:ascii="Arial" w:cs="Arial" w:eastAsia="Arial" w:hAnsi="Arial"/>
+                <w:b w:val="false"/>
+                <w:bCs w:val="false"/>
+                <w:color w:val="3C3C3C"/>
+                <w:sz w:val="18"/>
+                <w:szCs w:val="18"/>
+              </w:rPr>
+              <w:t xml:space="preserve">Persist satellite image file path in the .arld project file; reload the image automatically when the project is opened (issue #19)</w:t>
+            </w:r>
+          </w:p>
+        </w:tc>
+        <w:tc>
+          <w:tcPr>
+            <w:tcW w:type="dxa" w:w="1560"/>
+            <w:tcBorders>
+              <w:top w:val="single" w:color="C8CDD6" w:sz="1"/>
+              <w:left w:val="single" w:color="C8CDD6" w:sz="1"/>
+              <w:bottom w:val="single" w:color="C8CDD6" w:sz="1"/>
+              <w:right w:val="single" w:color="C8CDD6" w:sz="1"/>
+            </w:tcBorders>
+            <w:shd w:fill="FFFFFF" w:val="clear"/>
+            <w:tcMar>
+              <w:top w:type="dxa" w:w="70"/>
+              <w:left w:type="dxa" w:w="80"/>
+              <w:bottom w:type="dxa" w:w="70"/>
+              <w:right w:type="dxa" w:w="80"/>
+            </w:tcMar>
+          </w:tcPr>
+          <w:p>
+            <w:pPr>
+              <w:jc w:val="left"/>
+            </w:pPr>
+            <w:r>
+              <w:rPr>
+                <w:rFonts w:ascii="Arial" w:cs="Arial" w:eastAsia="Arial" w:hAnsi="Arial"/>
+                <w:b w:val="false"/>
+                <w:bCs w:val="false"/>
+                <w:color w:val="3C3C3C"/>
+                <w:sz w:val="18"/>
+                <w:szCs w:val="18"/>
+              </w:rPr>
+              <w:t xml:space="preserve">TRD-PERSIST-006 / FRD SAT-010</w:t>
+            </w:r>
+          </w:p>
+        </w:tc>
+        <w:tc>
+          <w:tcPr>
+            <w:tcW w:type="dxa" w:w="1400"/>
+            <w:tcBorders>
+              <w:top w:val="single" w:color="C8CDD6" w:sz="1"/>
+              <w:left w:val="single" w:color="C8CDD6" w:sz="1"/>
+              <w:bottom w:val="single" w:color="C8CDD6" w:sz="1"/>
+              <w:right w:val="single" w:color="C8CDD6" w:sz="1"/>
+            </w:tcBorders>
+            <w:shd w:fill="FFFFFF" w:val="clear"/>
+            <w:tcMar>
+              <w:top w:type="dxa" w:w="70"/>
+              <w:left w:type="dxa" w:w="100"/>
+              <w:bottom w:type="dxa" w:w="70"/>
+              <w:right w:type="dxa" w:w="80"/>
+            </w:tcMar>
+          </w:tcPr>
+          <w:p>
+            <w:pPr>
+              <w:jc w:val="left"/>
+            </w:pPr>
+            <w:r>
+              <w:rPr>
+                <w:rFonts w:ascii="Arial" w:cs="Arial" w:eastAsia="Arial" w:hAnsi="Arial"/>
+                <w:b w:val="false"/>
+                <w:bCs w:val="false"/>
+                <w:color w:val="3C3C3C"/>
+                <w:sz w:val="18"/>
+                <w:szCs w:val="18"/>
+              </w:rPr>
+              <w:t xml:space="preserve">Lead C++ Eng</w:t>
+            </w:r>
+          </w:p>
+        </w:tc>
+        <w:tc>
+          <w:tcPr>
+            <w:tcW w:type="dxa" w:w="700"/>
+            <w:tcBorders>
+              <w:top w:val="single" w:color="C8CDD6" w:sz="1"/>
+              <w:left w:val="single" w:color="C8CDD6" w:sz="1"/>
+              <w:bottom w:val="single" w:color="C8CDD6" w:sz="1"/>
+              <w:right w:val="single" w:color="C8CDD6" w:sz="1"/>
+            </w:tcBorders>
+            <w:shd w:fill="D5F5D5" w:val="clear"/>
+            <w:tcMar>
+              <w:top w:type="dxa" w:w="70"/>
+              <w:left w:type="dxa" w:w="100"/>
+              <w:bottom w:type="dxa" w:w="70"/>
+              <w:right w:type="dxa" w:w="80"/>
+            </w:tcMar>
+            <w:vAlign w:val="center"/>
+          </w:tcPr>
+          <w:p>
+            <w:pPr>
+              <w:jc w:val="center"/>
+            </w:pPr>
+            <w:r>
+              <w:rPr>
+                <w:rFonts w:ascii="Arial" w:cs="Arial" w:eastAsia="Arial" w:hAnsi="Arial"/>
+                <w:b w:val="false"/>
+                <w:bCs w:val="false"/>
+                <w:color w:val="3C3C3C"/>
+                <w:sz w:val="18"/>
+                <w:szCs w:val="18"/>
+              </w:rPr>
+              <w:t xml:space="preserve">5</w:t>
+            </w:r>
+          </w:p>
+        </w:tc>
+        <w:tc>
+          <w:tcPr>
+            <w:tcW w:type="dxa" w:w="4700"/>
+            <w:tcBorders>
+              <w:top w:val="single" w:color="C8CDD6" w:sz="1"/>
+              <w:left w:val="single" w:color="C8CDD6" w:sz="1"/>
+              <w:bottom w:val="single" w:color="C8CDD6" w:sz="1"/>
+              <w:right w:val="single" w:color="C8CDD6" w:sz="1"/>
+            </w:tcBorders>
+            <w:shd w:fill="FFFFFF" w:val="clear"/>
+            <w:tcMar>
+              <w:top w:type="dxa" w:w="70"/>
+              <w:left w:type="dxa" w:w="100"/>
+              <w:bottom w:type="dxa" w:w="70"/>
+              <w:right w:type="dxa" w:w="80"/>
+            </w:tcMar>
+          </w:tcPr>
+          <w:p>
+            <w:pPr>
+              <w:jc w:val="left"/>
+            </w:pPr>
+            <w:r>
+              <w:rPr>
+                <w:rFonts w:ascii="Arial" w:cs="Arial" w:eastAsia="Arial" w:hAnsi="Arial"/>
+                <w:b w:val="false"/>
+                <w:bCs w:val="false"/>
+                <w:color w:val="3C3C3C"/>
+                <w:sz w:val="18"/>
+                <w:szCs w:val="18"/>
+              </w:rPr>
+              <w:t xml:space="preserve">Round-trip test: save project with satellite loaded, close and reopen, image visible at same position and scale; missing file produces a user-facing warning</w:t>
+            </w:r>
+          </w:p>
+        </w:tc>
+      </w:tr>
+      <w:tr>
+        <w:tc>
+          <w:tcPr>
+            <w:tcW w:type="dxa" w:w="1000"/>
+            <w:tcBorders>
+              <w:top w:val="single" w:color="C8CDD6" w:sz="1"/>
+              <w:left w:val="single" w:color="C8CDD6" w:sz="1"/>
+              <w:bottom w:val="single" w:color="C8CDD6" w:sz="1"/>
+              <w:right w:val="single" w:color="C8CDD6" w:sz="1"/>
+            </w:tcBorders>
+            <w:shd w:fill="F2F4F7" w:val="clear"/>
+            <w:tcMar>
+              <w:top w:type="dxa" w:w="70"/>
+              <w:left w:type="dxa" w:w="100"/>
+              <w:bottom w:type="dxa" w:w="70"/>
+              <w:right w:type="dxa" w:w="80"/>
+            </w:tcMar>
+            <w:vAlign w:val="center"/>
+          </w:tcPr>
+          <w:p>
+            <w:pPr>
+              <w:jc w:val="center"/>
+            </w:pPr>
+            <w:r>
+              <w:rPr>
+                <w:rFonts w:ascii="Arial" w:cs="Arial" w:eastAsia="Arial" w:hAnsi="Arial"/>
+                <w:b/>
+                <w:bCs/>
+                <w:color w:val="1B2A4A"/>
+                <w:sz w:val="17"/>
+                <w:szCs w:val="17"/>
+              </w:rPr>
+              <w:t xml:space="preserve">3-2-4</w:t>
+            </w:r>
+          </w:p>
+        </w:tc>
+        <w:tc>
+          <w:tcPr>
+            <w:tcW w:type="dxa" w:w="3600"/>
+            <w:tcBorders>
+              <w:top w:val="single" w:color="C8CDD6" w:sz="1"/>
+              <w:left w:val="single" w:color="C8CDD6" w:sz="1"/>
+              <w:bottom w:val="single" w:color="C8CDD6" w:sz="1"/>
+              <w:right w:val="single" w:color="C8CDD6" w:sz="1"/>
+            </w:tcBorders>
+            <w:shd w:fill="F2F4F7" w:val="clear"/>
+            <w:tcMar>
+              <w:top w:type="dxa" w:w="70"/>
+              <w:left w:type="dxa" w:w="100"/>
+              <w:bottom w:type="dxa" w:w="70"/>
+              <w:right w:type="dxa" w:w="80"/>
+            </w:tcMar>
+          </w:tcPr>
+          <w:p>
+            <w:pPr>
+              <w:jc w:val="left"/>
+            </w:pPr>
+            <w:r>
+              <w:rPr>
+                <w:rFonts w:ascii="Arial" w:cs="Arial" w:eastAsia="Arial" w:hAnsi="Arial"/>
+                <w:b w:val="false"/>
+                <w:bCs w:val="false"/>
+                <w:color w:val="3C3C3C"/>
+                <w:sz w:val="18"/>
+                <w:szCs w:val="18"/>
+              </w:rPr>
+              <w:t xml:space="preserve">Restore missing File → Export PNG and File → Export JPEG menu items absent from the v1.0 shipped menu (issue #20)</w:t>
+            </w:r>
+          </w:p>
+        </w:tc>
+        <w:tc>
+          <w:tcPr>
+            <w:tcW w:type="dxa" w:w="1560"/>
+            <w:tcBorders>
+              <w:top w:val="single" w:color="C8CDD6" w:sz="1"/>
+              <w:left w:val="single" w:color="C8CDD6" w:sz="1"/>
+              <w:bottom w:val="single" w:color="C8CDD6" w:sz="1"/>
+              <w:right w:val="single" w:color="C8CDD6" w:sz="1"/>
+            </w:tcBorders>
+            <w:shd w:fill="F2F4F7" w:val="clear"/>
+            <w:tcMar>
+              <w:top w:type="dxa" w:w="70"/>
+              <w:left w:type="dxa" w:w="80"/>
+              <w:bottom w:type="dxa" w:w="70"/>
+              <w:right w:type="dxa" w:w="80"/>
+            </w:tcMar>
+          </w:tcPr>
+          <w:p>
+            <w:pPr>
+              <w:jc w:val="left"/>
+            </w:pPr>
+            <w:r>
+              <w:rPr>
+                <w:rFonts w:ascii="Arial" w:cs="Arial" w:eastAsia="Arial" w:hAnsi="Arial"/>
+                <w:b w:val="false"/>
+                <w:bCs w:val="false"/>
+                <w:color w:val="3C3C3C"/>
+                <w:sz w:val="18"/>
+                <w:szCs w:val="18"/>
+              </w:rPr>
+              <w:t xml:space="preserve">TRD-EXPORT-004 / FRD EXP-020–021</w:t>
+            </w:r>
+          </w:p>
+        </w:tc>
+        <w:tc>
+          <w:tcPr>
+            <w:tcW w:type="dxa" w:w="1400"/>
+            <w:tcBorders>
+              <w:top w:val="single" w:color="C8CDD6" w:sz="1"/>
+              <w:left w:val="single" w:color="C8CDD6" w:sz="1"/>
+              <w:bottom w:val="single" w:color="C8CDD6" w:sz="1"/>
+              <w:right w:val="single" w:color="C8CDD6" w:sz="1"/>
+            </w:tcBorders>
+            <w:shd w:fill="F2F4F7" w:val="clear"/>
+            <w:tcMar>
+              <w:top w:type="dxa" w:w="70"/>
+              <w:left w:type="dxa" w:w="100"/>
+              <w:bottom w:type="dxa" w:w="70"/>
+              <w:right w:type="dxa" w:w="80"/>
+            </w:tcMar>
+          </w:tcPr>
+          <w:p>
+            <w:pPr>
+              <w:jc w:val="left"/>
+            </w:pPr>
+            <w:r>
+              <w:rPr>
+                <w:rFonts w:ascii="Arial" w:cs="Arial" w:eastAsia="Arial" w:hAnsi="Arial"/>
+                <w:b w:val="false"/>
+                <w:bCs w:val="false"/>
+                <w:color w:val="3C3C3C"/>
+                <w:sz w:val="18"/>
+                <w:szCs w:val="18"/>
+              </w:rPr>
+              <w:t xml:space="preserve">Lead C++ Eng</w:t>
+            </w:r>
+          </w:p>
+        </w:tc>
+        <w:tc>
+          <w:tcPr>
+            <w:tcW w:type="dxa" w:w="700"/>
+            <w:tcBorders>
+              <w:top w:val="single" w:color="C8CDD6" w:sz="1"/>
+              <w:left w:val="single" w:color="C8CDD6" w:sz="1"/>
+              <w:bottom w:val="single" w:color="C8CDD6" w:sz="1"/>
+              <w:right w:val="single" w:color="C8CDD6" w:sz="1"/>
+            </w:tcBorders>
+            <w:shd w:fill="D5F5D5" w:val="clear"/>
+            <w:tcMar>
+              <w:top w:type="dxa" w:w="70"/>
+              <w:left w:type="dxa" w:w="100"/>
+              <w:bottom w:type="dxa" w:w="70"/>
+              <w:right w:type="dxa" w:w="80"/>
+            </w:tcMar>
+            <w:vAlign w:val="center"/>
+          </w:tcPr>
+          <w:p>
+            <w:pPr>
+              <w:jc w:val="center"/>
+            </w:pPr>
+            <w:r>
+              <w:rPr>
+                <w:rFonts w:ascii="Arial" w:cs="Arial" w:eastAsia="Arial" w:hAnsi="Arial"/>
+                <w:b w:val="false"/>
+                <w:bCs w:val="false"/>
+                <w:color w:val="3C3C3C"/>
+                <w:sz w:val="18"/>
+                <w:szCs w:val="18"/>
+              </w:rPr>
+              <w:t xml:space="preserve">3</w:t>
+            </w:r>
+          </w:p>
+        </w:tc>
+        <w:tc>
+          <w:tcPr>
+            <w:tcW w:type="dxa" w:w="4700"/>
+            <w:tcBorders>
+              <w:top w:val="single" w:color="C8CDD6" w:sz="1"/>
+              <w:left w:val="single" w:color="C8CDD6" w:sz="1"/>
+              <w:bottom w:val="single" w:color="C8CDD6" w:sz="1"/>
+              <w:right w:val="single" w:color="C8CDD6" w:sz="1"/>
+            </w:tcBorders>
+            <w:shd w:fill="F2F4F7" w:val="clear"/>
+            <w:tcMar>
+              <w:top w:type="dxa" w:w="70"/>
+              <w:left w:type="dxa" w:w="100"/>
+              <w:bottom w:type="dxa" w:w="70"/>
+              <w:right w:type="dxa" w:w="80"/>
+            </w:tcMar>
+          </w:tcPr>
+          <w:p>
+            <w:pPr>
+              <w:jc w:val="left"/>
+            </w:pPr>
+            <w:r>
+              <w:rPr>
+                <w:rFonts w:ascii="Arial" w:cs="Arial" w:eastAsia="Arial" w:hAnsi="Arial"/>
+                <w:b w:val="false"/>
+                <w:bCs w:val="false"/>
+                <w:color w:val="3C3C3C"/>
+                <w:sz w:val="18"/>
+                <w:szCs w:val="18"/>
+              </w:rPr>
+              <w:t xml:space="preserve">File → Export PNG and File → Export JPEG present and functional; ExportOptions dialog opens; output file written to disk</w:t>
+            </w:r>
+          </w:p>
+        </w:tc>
+      </w:tr>
+      <w:tr>
+        <w:tc>
+          <w:tcPr>
+            <w:tcW w:type="dxa" w:w="1000"/>
+            <w:tcBorders>
+              <w:top w:val="single" w:color="C8CDD6" w:sz="1"/>
+              <w:left w:val="single" w:color="C8CDD6" w:sz="1"/>
+              <w:bottom w:val="single" w:color="C8CDD6" w:sz="1"/>
+              <w:right w:val="single" w:color="C8CDD6" w:sz="1"/>
+            </w:tcBorders>
+            <w:shd w:fill="FFFFFF" w:val="clear"/>
+            <w:tcMar>
+              <w:top w:type="dxa" w:w="70"/>
+              <w:left w:type="dxa" w:w="100"/>
+              <w:bottom w:type="dxa" w:w="70"/>
+              <w:right w:type="dxa" w:w="80"/>
+            </w:tcMar>
+            <w:vAlign w:val="center"/>
+          </w:tcPr>
+          <w:p>
+            <w:pPr>
+              <w:jc w:val="center"/>
+            </w:pPr>
+            <w:r>
+              <w:rPr>
+                <w:rFonts w:ascii="Arial" w:cs="Arial" w:eastAsia="Arial" w:hAnsi="Arial"/>
+                <w:b/>
+                <w:bCs/>
+                <w:color w:val="1B2A4A"/>
+                <w:sz w:val="17"/>
+                <w:szCs w:val="17"/>
+              </w:rPr>
+              <w:t xml:space="preserve">3-2-5</w:t>
+            </w:r>
+          </w:p>
+        </w:tc>
+        <w:tc>
+          <w:tcPr>
+            <w:tcW w:type="dxa" w:w="3600"/>
+            <w:tcBorders>
+              <w:top w:val="single" w:color="C8CDD6" w:sz="1"/>
+              <w:left w:val="single" w:color="C8CDD6" w:sz="1"/>
+              <w:bottom w:val="single" w:color="C8CDD6" w:sz="1"/>
+              <w:right w:val="single" w:color="C8CDD6" w:sz="1"/>
+            </w:tcBorders>
+            <w:shd w:fill="FFFFFF" w:val="clear"/>
+            <w:tcMar>
+              <w:top w:type="dxa" w:w="70"/>
+              <w:left w:type="dxa" w:w="100"/>
+              <w:bottom w:type="dxa" w:w="70"/>
+              <w:right w:type="dxa" w:w="80"/>
+            </w:tcMar>
+          </w:tcPr>
+          <w:p>
+            <w:pPr>
+              <w:jc w:val="left"/>
+            </w:pPr>
+            <w:r>
+              <w:rPr>
+                <w:rFonts w:ascii="Arial" w:cs="Arial" w:eastAsia="Arial" w:hAnsi="Arial"/>
+                <w:b w:val="false"/>
+                <w:bCs w:val="false"/>
+                <w:color w:val="3C3C3C"/>
+                <w:sz w:val="18"/>
+                <w:szCs w:val="18"/>
+              </w:rPr>
+              <w:t xml:space="preserve">Fix dock widget resize handle for the Properties / Undo History panel: dragging the splitter handle currently has no effect (issue #21)</w:t>
+            </w:r>
+          </w:p>
+        </w:tc>
+        <w:tc>
+          <w:tcPr>
+            <w:tcW w:type="dxa" w:w="1560"/>
+            <w:tcBorders>
+              <w:top w:val="single" w:color="C8CDD6" w:sz="1"/>
+              <w:left w:val="single" w:color="C8CDD6" w:sz="1"/>
+              <w:bottom w:val="single" w:color="C8CDD6" w:sz="1"/>
+              <w:right w:val="single" w:color="C8CDD6" w:sz="1"/>
+            </w:tcBorders>
+            <w:shd w:fill="FFFFFF" w:val="clear"/>
+            <w:tcMar>
+              <w:top w:type="dxa" w:w="70"/>
+              <w:left w:type="dxa" w:w="80"/>
+              <w:bottom w:type="dxa" w:w="70"/>
+              <w:right w:type="dxa" w:w="80"/>
+            </w:tcMar>
+          </w:tcPr>
+          <w:p>
+            <w:pPr>
+              <w:jc w:val="left"/>
+            </w:pPr>
+            <w:r>
+              <w:rPr>
+                <w:rFonts w:ascii="Arial" w:cs="Arial" w:eastAsia="Arial" w:hAnsi="Arial"/>
+                <w:b w:val="false"/>
+                <w:bCs w:val="false"/>
+                <w:color w:val="3C3C3C"/>
+                <w:sz w:val="18"/>
+                <w:szCs w:val="18"/>
+              </w:rPr>
+              <w:t xml:space="preserve">TRD-UI-011</w:t>
+            </w:r>
+          </w:p>
+        </w:tc>
+        <w:tc>
+          <w:tcPr>
+            <w:tcW w:type="dxa" w:w="1400"/>
+            <w:tcBorders>
+              <w:top w:val="single" w:color="C8CDD6" w:sz="1"/>
+              <w:left w:val="single" w:color="C8CDD6" w:sz="1"/>
+              <w:bottom w:val="single" w:color="C8CDD6" w:sz="1"/>
+              <w:right w:val="single" w:color="C8CDD6" w:sz="1"/>
+            </w:tcBorders>
+            <w:shd w:fill="FFFFFF" w:val="clear"/>
+            <w:tcMar>
+              <w:top w:type="dxa" w:w="70"/>
+              <w:left w:type="dxa" w:w="100"/>
+              <w:bottom w:type="dxa" w:w="70"/>
+              <w:right w:type="dxa" w:w="80"/>
+            </w:tcMar>
+          </w:tcPr>
+          <w:p>
+            <w:pPr>
+              <w:jc w:val="left"/>
+            </w:pPr>
+            <w:r>
+              <w:rPr>
+                <w:rFonts w:ascii="Arial" w:cs="Arial" w:eastAsia="Arial" w:hAnsi="Arial"/>
+                <w:b w:val="false"/>
+                <w:bCs w:val="false"/>
+                <w:color w:val="3C3C3C"/>
+                <w:sz w:val="18"/>
+                <w:szCs w:val="18"/>
+              </w:rPr>
+              <w:t xml:space="preserve">C++ Eng #2</w:t>
+            </w:r>
+          </w:p>
+        </w:tc>
+        <w:tc>
+          <w:tcPr>
+            <w:tcW w:type="dxa" w:w="700"/>
+            <w:tcBorders>
+              <w:top w:val="single" w:color="C8CDD6" w:sz="1"/>
+              <w:left w:val="single" w:color="C8CDD6" w:sz="1"/>
+              <w:bottom w:val="single" w:color="C8CDD6" w:sz="1"/>
+              <w:right w:val="single" w:color="C8CDD6" w:sz="1"/>
+            </w:tcBorders>
+            <w:shd w:fill="D5F5D5" w:val="clear"/>
+            <w:tcMar>
+              <w:top w:type="dxa" w:w="70"/>
+              <w:left w:type="dxa" w:w="100"/>
+              <w:bottom w:type="dxa" w:w="70"/>
+              <w:right w:type="dxa" w:w="80"/>
+            </w:tcMar>
+            <w:vAlign w:val="center"/>
+          </w:tcPr>
+          <w:p>
+            <w:pPr>
+              <w:jc w:val="center"/>
+            </w:pPr>
+            <w:r>
+              <w:rPr>
+                <w:rFonts w:ascii="Arial" w:cs="Arial" w:eastAsia="Arial" w:hAnsi="Arial"/>
+                <w:b w:val="false"/>
+                <w:bCs w:val="false"/>
+                <w:color w:val="3C3C3C"/>
+                <w:sz w:val="18"/>
+                <w:szCs w:val="18"/>
+              </w:rPr>
+              <w:t xml:space="preserve">3</w:t>
+            </w:r>
+          </w:p>
+        </w:tc>
+        <w:tc>
+          <w:tcPr>
+            <w:tcW w:type="dxa" w:w="4700"/>
+            <w:tcBorders>
+              <w:top w:val="single" w:color="C8CDD6" w:sz="1"/>
+              <w:left w:val="single" w:color="C8CDD6" w:sz="1"/>
+              <w:bottom w:val="single" w:color="C8CDD6" w:sz="1"/>
+              <w:right w:val="single" w:color="C8CDD6" w:sz="1"/>
+            </w:tcBorders>
+            <w:shd w:fill="FFFFFF" w:val="clear"/>
+            <w:tcMar>
+              <w:top w:type="dxa" w:w="70"/>
+              <w:left w:type="dxa" w:w="100"/>
+              <w:bottom w:type="dxa" w:w="70"/>
+              <w:right w:type="dxa" w:w="80"/>
+            </w:tcMar>
+          </w:tcPr>
+          <w:p>
+            <w:pPr>
+              <w:jc w:val="left"/>
+            </w:pPr>
+            <w:r>
+              <w:rPr>
+                <w:rFonts w:ascii="Arial" w:cs="Arial" w:eastAsia="Arial" w:hAnsi="Arial"/>
+                <w:b w:val="false"/>
+                <w:bCs w:val="false"/>
+                <w:color w:val="3C3C3C"/>
+                <w:sz w:val="18"/>
+                <w:szCs w:val="18"/>
+              </w:rPr>
+              <w:t xml:space="preserve">Properties and Undo History panels are resizable by dragging the dock splitter on macOS, Linux, and Windows</w:t>
+            </w:r>
+          </w:p>
+        </w:tc>
+      </w:tr>
+      <w:tr>
+        <w:tc>
+          <w:tcPr>
+            <w:tcW w:type="dxa" w:w="1000"/>
+            <w:tcBorders>
+              <w:top w:val="single" w:color="C8CDD6" w:sz="1"/>
+              <w:left w:val="single" w:color="C8CDD6" w:sz="1"/>
+              <w:bottom w:val="single" w:color="C8CDD6" w:sz="1"/>
+              <w:right w:val="single" w:color="C8CDD6" w:sz="1"/>
+            </w:tcBorders>
+            <w:shd w:fill="F2F4F7" w:val="clear"/>
+            <w:tcMar>
+              <w:top w:type="dxa" w:w="70"/>
+              <w:left w:type="dxa" w:w="100"/>
+              <w:bottom w:type="dxa" w:w="70"/>
+              <w:right w:type="dxa" w:w="80"/>
+            </w:tcMar>
+            <w:vAlign w:val="center"/>
+          </w:tcPr>
+          <w:p>
+            <w:pPr>
+              <w:jc w:val="center"/>
+            </w:pPr>
+            <w:r>
+              <w:rPr>
+                <w:rFonts w:ascii="Arial" w:cs="Arial" w:eastAsia="Arial" w:hAnsi="Arial"/>
+                <w:b/>
+                <w:bCs/>
+                <w:color w:val="1B2A4A"/>
+                <w:sz w:val="17"/>
+                <w:szCs w:val="17"/>
+              </w:rPr>
+              <w:t xml:space="preserve">3-2-6</w:t>
+            </w:r>
+          </w:p>
+        </w:tc>
+        <w:tc>
+          <w:tcPr>
+            <w:tcW w:type="dxa" w:w="3600"/>
+            <w:tcBorders>
+              <w:top w:val="single" w:color="C8CDD6" w:sz="1"/>
+              <w:left w:val="single" w:color="C8CDD6" w:sz="1"/>
+              <w:bottom w:val="single" w:color="C8CDD6" w:sz="1"/>
+              <w:right w:val="single" w:color="C8CDD6" w:sz="1"/>
+            </w:tcBorders>
+            <w:shd w:fill="F2F4F7" w:val="clear"/>
+            <w:tcMar>
+              <w:top w:type="dxa" w:w="70"/>
+              <w:left w:type="dxa" w:w="100"/>
+              <w:bottom w:type="dxa" w:w="70"/>
+              <w:right w:type="dxa" w:w="80"/>
+            </w:tcMar>
+          </w:tcPr>
+          <w:p>
+            <w:pPr>
+              <w:jc w:val="left"/>
+            </w:pPr>
+            <w:r>
+              <w:rPr>
+                <w:rFonts w:ascii="Arial" w:cs="Arial" w:eastAsia="Arial" w:hAnsi="Arial"/>
+                <w:b w:val="false"/>
+                <w:bCs w:val="false"/>
+                <w:color w:val="3C3C3C"/>
+                <w:sz w:val="18"/>
+                <w:szCs w:val="18"/>
+              </w:rPr>
+              <w:t xml:space="preserve">Match the canvas scene scale to the pixel scale displayed in the satellite image bottom-right overlay (issue #16)</w:t>
+            </w:r>
+          </w:p>
+        </w:tc>
+        <w:tc>
+          <w:tcPr>
+            <w:tcW w:type="dxa" w:w="1560"/>
+            <w:tcBorders>
+              <w:top w:val="single" w:color="C8CDD6" w:sz="1"/>
+              <w:left w:val="single" w:color="C8CDD6" w:sz="1"/>
+              <w:bottom w:val="single" w:color="C8CDD6" w:sz="1"/>
+              <w:right w:val="single" w:color="C8CDD6" w:sz="1"/>
+            </w:tcBorders>
+            <w:shd w:fill="F2F4F7" w:val="clear"/>
+            <w:tcMar>
+              <w:top w:type="dxa" w:w="70"/>
+              <w:left w:type="dxa" w:w="80"/>
+              <w:bottom w:type="dxa" w:w="70"/>
+              <w:right w:type="dxa" w:w="80"/>
+            </w:tcMar>
+          </w:tcPr>
+          <w:p>
+            <w:pPr>
+              <w:jc w:val="left"/>
+            </w:pPr>
+            <w:r>
+              <w:rPr>
+                <w:rFonts w:ascii="Arial" w:cs="Arial" w:eastAsia="Arial" w:hAnsi="Arial"/>
+                <w:b w:val="false"/>
+                <w:bCs w:val="false"/>
+                <w:color w:val="3C3C3C"/>
+                <w:sz w:val="18"/>
+                <w:szCs w:val="18"/>
+              </w:rPr>
+              <w:t xml:space="preserve">TRD-SAT-003 / FRD SAT-005</w:t>
+            </w:r>
+          </w:p>
+        </w:tc>
+        <w:tc>
+          <w:tcPr>
+            <w:tcW w:type="dxa" w:w="1400"/>
+            <w:tcBorders>
+              <w:top w:val="single" w:color="C8CDD6" w:sz="1"/>
+              <w:left w:val="single" w:color="C8CDD6" w:sz="1"/>
+              <w:bottom w:val="single" w:color="C8CDD6" w:sz="1"/>
+              <w:right w:val="single" w:color="C8CDD6" w:sz="1"/>
+            </w:tcBorders>
+            <w:shd w:fill="F2F4F7" w:val="clear"/>
+            <w:tcMar>
+              <w:top w:type="dxa" w:w="70"/>
+              <w:left w:type="dxa" w:w="100"/>
+              <w:bottom w:type="dxa" w:w="70"/>
+              <w:right w:type="dxa" w:w="80"/>
+            </w:tcMar>
+          </w:tcPr>
+          <w:p>
+            <w:pPr>
+              <w:jc w:val="left"/>
+            </w:pPr>
+            <w:r>
+              <w:rPr>
+                <w:rFonts w:ascii="Arial" w:cs="Arial" w:eastAsia="Arial" w:hAnsi="Arial"/>
+                <w:b w:val="false"/>
+                <w:bCs w:val="false"/>
+                <w:color w:val="3C3C3C"/>
+                <w:sz w:val="18"/>
+                <w:szCs w:val="18"/>
+              </w:rPr>
+              <w:t xml:space="preserve">Lead C++ Eng</w:t>
+            </w:r>
+          </w:p>
+        </w:tc>
+        <w:tc>
+          <w:tcPr>
+            <w:tcW w:type="dxa" w:w="700"/>
+            <w:tcBorders>
+              <w:top w:val="single" w:color="C8CDD6" w:sz="1"/>
+              <w:left w:val="single" w:color="C8CDD6" w:sz="1"/>
+              <w:bottom w:val="single" w:color="C8CDD6" w:sz="1"/>
+              <w:right w:val="single" w:color="C8CDD6" w:sz="1"/>
+            </w:tcBorders>
+            <w:shd w:fill="D5F5D5" w:val="clear"/>
+            <w:tcMar>
+              <w:top w:type="dxa" w:w="70"/>
+              <w:left w:type="dxa" w:w="100"/>
+              <w:bottom w:type="dxa" w:w="70"/>
+              <w:right w:type="dxa" w:w="80"/>
+            </w:tcMar>
+            <w:vAlign w:val="center"/>
+          </w:tcPr>
+          <w:p>
+            <w:pPr>
+              <w:jc w:val="center"/>
+            </w:pPr>
+            <w:r>
+              <w:rPr>
+                <w:rFonts w:ascii="Arial" w:cs="Arial" w:eastAsia="Arial" w:hAnsi="Arial"/>
+                <w:b w:val="false"/>
+                <w:bCs w:val="false"/>
+                <w:color w:val="3C3C3C"/>
+                <w:sz w:val="18"/>
+                <w:szCs w:val="18"/>
+              </w:rPr>
+              <w:t xml:space="preserve">5</w:t>
+            </w:r>
+          </w:p>
+        </w:tc>
+        <w:tc>
+          <w:tcPr>
+            <w:tcW w:type="dxa" w:w="4700"/>
+            <w:tcBorders>
+              <w:top w:val="single" w:color="C8CDD6" w:sz="1"/>
+              <w:left w:val="single" w:color="C8CDD6" w:sz="1"/>
+              <w:bottom w:val="single" w:color="C8CDD6" w:sz="1"/>
+              <w:right w:val="single" w:color="C8CDD6" w:sz="1"/>
+            </w:tcBorders>
+            <w:shd w:fill="F2F4F7" w:val="clear"/>
+            <w:tcMar>
+              <w:top w:type="dxa" w:w="70"/>
+              <w:left w:type="dxa" w:w="100"/>
+              <w:bottom w:type="dxa" w:w="70"/>
+              <w:right w:type="dxa" w:w="80"/>
+            </w:tcMar>
+          </w:tcPr>
+          <w:p>
+            <w:pPr>
+              <w:jc w:val="left"/>
+            </w:pPr>
+            <w:r>
+              <w:rPr>
+                <w:rFonts w:ascii="Arial" w:cs="Arial" w:eastAsia="Arial" w:hAnsi="Arial"/>
+                <w:b w:val="false"/>
+                <w:bCs w:val="false"/>
+                <w:color w:val="3C3C3C"/>
+                <w:sz w:val="18"/>
+                <w:szCs w:val="18"/>
+              </w:rPr>
+              <w:t xml:space="preserve">Canvas GSD matches image scale overlay within 5%; scale bar updates when image is loaded; existing Satellite Tiles dialog auto-populates GSD from image metadata where available</w:t>
+            </w:r>
+          </w:p>
+        </w:tc>
+      </w:tr>
+      <w:tr>
+        <w:tc>
+          <w:tcPr>
+            <w:tcW w:type="dxa" w:w="1000"/>
+            <w:tcBorders>
+              <w:top w:val="single" w:color="C8CDD6" w:sz="1"/>
+              <w:left w:val="single" w:color="C8CDD6" w:sz="1"/>
+              <w:bottom w:val="single" w:color="C8CDD6" w:sz="1"/>
+              <w:right w:val="single" w:color="C8CDD6" w:sz="1"/>
+            </w:tcBorders>
+            <w:shd w:fill="FFFFFF" w:val="clear"/>
+            <w:tcMar>
+              <w:top w:type="dxa" w:w="70"/>
+              <w:left w:type="dxa" w:w="100"/>
+              <w:bottom w:type="dxa" w:w="70"/>
+              <w:right w:type="dxa" w:w="80"/>
+            </w:tcMar>
+            <w:vAlign w:val="center"/>
+          </w:tcPr>
+          <w:p>
+            <w:pPr>
+              <w:jc w:val="center"/>
+            </w:pPr>
+            <w:r>
+              <w:rPr>
+                <w:rFonts w:ascii="Arial" w:cs="Arial" w:eastAsia="Arial" w:hAnsi="Arial"/>
+                <w:b/>
+                <w:bCs/>
+                <w:color w:val="1B2A4A"/>
+                <w:sz w:val="17"/>
+                <w:szCs w:val="17"/>
+              </w:rPr>
+              <w:t xml:space="preserve">3-2-7</w:t>
+            </w:r>
+          </w:p>
+        </w:tc>
+        <w:tc>
+          <w:tcPr>
+            <w:tcW w:type="dxa" w:w="3600"/>
+            <w:tcBorders>
+              <w:top w:val="single" w:color="C8CDD6" w:sz="1"/>
+              <w:left w:val="single" w:color="C8CDD6" w:sz="1"/>
+              <w:bottom w:val="single" w:color="C8CDD6" w:sz="1"/>
+              <w:right w:val="single" w:color="C8CDD6" w:sz="1"/>
+            </w:tcBorders>
+            <w:shd w:fill="FFFFFF" w:val="clear"/>
+            <w:tcMar>
+              <w:top w:type="dxa" w:w="70"/>
+              <w:left w:type="dxa" w:w="100"/>
+              <w:bottom w:type="dxa" w:w="70"/>
+              <w:right w:type="dxa" w:w="80"/>
+            </w:tcMar>
+          </w:tcPr>
+          <w:p>
+            <w:pPr>
+              <w:jc w:val="left"/>
+            </w:pPr>
+            <w:r>
+              <w:rPr>
+                <w:rFonts w:ascii="Arial" w:cs="Arial" w:eastAsia="Arial" w:hAnsi="Arial"/>
+                <w:b w:val="false"/>
+                <w:bCs w:val="false"/>
+                <w:color w:val="3C3C3C"/>
+                <w:sz w:val="18"/>
+                <w:szCs w:val="18"/>
+              </w:rPr>
+              <w:t xml:space="preserve">Save dock panel sizes and positions to QSettings on application close; restore the saved layout on next launch (issue #22)</w:t>
+            </w:r>
+          </w:p>
+        </w:tc>
+        <w:tc>
+          <w:tcPr>
+            <w:tcW w:type="dxa" w:w="1560"/>
+            <w:tcBorders>
+              <w:top w:val="single" w:color="C8CDD6" w:sz="1"/>
+              <w:left w:val="single" w:color="C8CDD6" w:sz="1"/>
+              <w:bottom w:val="single" w:color="C8CDD6" w:sz="1"/>
+              <w:right w:val="single" w:color="C8CDD6" w:sz="1"/>
+            </w:tcBorders>
+            <w:shd w:fill="FFFFFF" w:val="clear"/>
+            <w:tcMar>
+              <w:top w:type="dxa" w:w="70"/>
+              <w:left w:type="dxa" w:w="80"/>
+              <w:bottom w:type="dxa" w:w="70"/>
+              <w:right w:type="dxa" w:w="80"/>
+            </w:tcMar>
+          </w:tcPr>
+          <w:p>
+            <w:pPr>
+              <w:jc w:val="left"/>
+            </w:pPr>
+            <w:r>
+              <w:rPr>
+                <w:rFonts w:ascii="Arial" w:cs="Arial" w:eastAsia="Arial" w:hAnsi="Arial"/>
+                <w:b w:val="false"/>
+                <w:bCs w:val="false"/>
+                <w:color w:val="3C3C3C"/>
+                <w:sz w:val="18"/>
+                <w:szCs w:val="18"/>
+              </w:rPr>
+              <w:t xml:space="preserve">FRD PLAT-012</w:t>
+            </w:r>
+          </w:p>
+        </w:tc>
+        <w:tc>
+          <w:tcPr>
+            <w:tcW w:type="dxa" w:w="1400"/>
+            <w:tcBorders>
+              <w:top w:val="single" w:color="C8CDD6" w:sz="1"/>
+              <w:left w:val="single" w:color="C8CDD6" w:sz="1"/>
+              <w:bottom w:val="single" w:color="C8CDD6" w:sz="1"/>
+              <w:right w:val="single" w:color="C8CDD6" w:sz="1"/>
+            </w:tcBorders>
+            <w:shd w:fill="FFFFFF" w:val="clear"/>
+            <w:tcMar>
+              <w:top w:type="dxa" w:w="70"/>
+              <w:left w:type="dxa" w:w="100"/>
+              <w:bottom w:type="dxa" w:w="70"/>
+              <w:right w:type="dxa" w:w="80"/>
+            </w:tcMar>
+          </w:tcPr>
+          <w:p>
+            <w:pPr>
+              <w:jc w:val="left"/>
+            </w:pPr>
+            <w:r>
+              <w:rPr>
+                <w:rFonts w:ascii="Arial" w:cs="Arial" w:eastAsia="Arial" w:hAnsi="Arial"/>
+                <w:b w:val="false"/>
+                <w:bCs w:val="false"/>
+                <w:color w:val="3C3C3C"/>
+                <w:sz w:val="18"/>
+                <w:szCs w:val="18"/>
+              </w:rPr>
+              <w:t xml:space="preserve">C++ Eng #2</w:t>
+            </w:r>
+          </w:p>
+        </w:tc>
+        <w:tc>
+          <w:tcPr>
+            <w:tcW w:type="dxa" w:w="700"/>
+            <w:tcBorders>
+              <w:top w:val="single" w:color="C8CDD6" w:sz="1"/>
+              <w:left w:val="single" w:color="C8CDD6" w:sz="1"/>
+              <w:bottom w:val="single" w:color="C8CDD6" w:sz="1"/>
+              <w:right w:val="single" w:color="C8CDD6" w:sz="1"/>
+            </w:tcBorders>
+            <w:shd w:fill="D5F5D5" w:val="clear"/>
+            <w:tcMar>
+              <w:top w:type="dxa" w:w="70"/>
+              <w:left w:type="dxa" w:w="100"/>
+              <w:bottom w:type="dxa" w:w="70"/>
+              <w:right w:type="dxa" w:w="80"/>
+            </w:tcMar>
+            <w:vAlign w:val="center"/>
+          </w:tcPr>
+          <w:p>
+            <w:pPr>
+              <w:jc w:val="center"/>
+            </w:pPr>
+            <w:r>
+              <w:rPr>
+                <w:rFonts w:ascii="Arial" w:cs="Arial" w:eastAsia="Arial" w:hAnsi="Arial"/>
+                <w:b w:val="false"/>
+                <w:bCs w:val="false"/>
+                <w:color w:val="3C3C3C"/>
+                <w:sz w:val="18"/>
+                <w:szCs w:val="18"/>
+              </w:rPr>
+              <w:t xml:space="preserve">5</w:t>
+            </w:r>
+          </w:p>
+        </w:tc>
+        <w:tc>
+          <w:tcPr>
+            <w:tcW w:type="dxa" w:w="4700"/>
+            <w:tcBorders>
+              <w:top w:val="single" w:color="C8CDD6" w:sz="1"/>
+              <w:left w:val="single" w:color="C8CDD6" w:sz="1"/>
+              <w:bottom w:val="single" w:color="C8CDD6" w:sz="1"/>
+              <w:right w:val="single" w:color="C8CDD6" w:sz="1"/>
+            </w:tcBorders>
+            <w:shd w:fill="FFFFFF" w:val="clear"/>
+            <w:tcMar>
+              <w:top w:type="dxa" w:w="70"/>
+              <w:left w:type="dxa" w:w="100"/>
+              <w:bottom w:type="dxa" w:w="70"/>
+              <w:right w:type="dxa" w:w="80"/>
+            </w:tcMar>
+          </w:tcPr>
+          <w:p>
+            <w:pPr>
+              <w:jc w:val="left"/>
+            </w:pPr>
+            <w:r>
+              <w:rPr>
+                <w:rFonts w:ascii="Arial" w:cs="Arial" w:eastAsia="Arial" w:hAnsi="Arial"/>
+                <w:b w:val="false"/>
+                <w:bCs w:val="false"/>
+                <w:color w:val="3C3C3C"/>
+                <w:sz w:val="18"/>
+                <w:szCs w:val="18"/>
+              </w:rPr>
+              <w:t xml:space="preserve">Panel layout is identical after app restart; QSettings key arld/dockGeometry written on close; first-launch defaults applied when key is absent</w:t>
+            </w:r>
+          </w:p>
+        </w:tc>
+      </w:tr>
+      <w:tr>
+        <w:tc>
+          <w:tcPr>
+            <w:tcW w:type="dxa" w:w="1000"/>
+            <w:tcBorders>
+              <w:top w:val="single" w:color="C8CDD6" w:sz="1"/>
+              <w:left w:val="single" w:color="C8CDD6" w:sz="1"/>
+              <w:bottom w:val="single" w:color="C8CDD6" w:sz="1"/>
+              <w:right w:val="single" w:color="C8CDD6" w:sz="1"/>
+            </w:tcBorders>
+            <w:shd w:fill="F2F4F7" w:val="clear"/>
+            <w:tcMar>
+              <w:top w:type="dxa" w:w="70"/>
+              <w:left w:type="dxa" w:w="100"/>
+              <w:bottom w:type="dxa" w:w="70"/>
+              <w:right w:type="dxa" w:w="80"/>
+            </w:tcMar>
+            <w:vAlign w:val="center"/>
+          </w:tcPr>
+          <w:p>
+            <w:pPr>
+              <w:jc w:val="center"/>
+            </w:pPr>
+            <w:r>
+              <w:rPr>
+                <w:rFonts w:ascii="Arial" w:cs="Arial" w:eastAsia="Arial" w:hAnsi="Arial"/>
+                <w:b/>
+                <w:bCs/>
+                <w:color w:val="1B2A4A"/>
+                <w:sz w:val="17"/>
+                <w:szCs w:val="17"/>
+              </w:rPr>
+              <w:t xml:space="preserve">3-2-8</w:t>
+            </w:r>
+          </w:p>
+        </w:tc>
+        <w:tc>
+          <w:tcPr>
+            <w:tcW w:type="dxa" w:w="3600"/>
+            <w:tcBorders>
+              <w:top w:val="single" w:color="C8CDD6" w:sz="1"/>
+              <w:left w:val="single" w:color="C8CDD6" w:sz="1"/>
+              <w:bottom w:val="single" w:color="C8CDD6" w:sz="1"/>
+              <w:right w:val="single" w:color="C8CDD6" w:sz="1"/>
+            </w:tcBorders>
+            <w:shd w:fill="F2F4F7" w:val="clear"/>
+            <w:tcMar>
+              <w:top w:type="dxa" w:w="70"/>
+              <w:left w:type="dxa" w:w="100"/>
+              <w:bottom w:type="dxa" w:w="70"/>
+              <w:right w:type="dxa" w:w="80"/>
+            </w:tcMar>
+          </w:tcPr>
+          <w:p>
+            <w:pPr>
+              <w:jc w:val="left"/>
+            </w:pPr>
+            <w:r>
+              <w:rPr>
+                <w:rFonts w:ascii="Arial" w:cs="Arial" w:eastAsia="Arial" w:hAnsi="Arial"/>
+                <w:b w:val="false"/>
+                <w:bCs w:val="false"/>
+                <w:color w:val="3C3C3C"/>
+                <w:sz w:val="18"/>
+                <w:szCs w:val="18"/>
+              </w:rPr>
+              <w:t xml:space="preserve">Add View menu toggle actions for each dock panel so a closed panel can be re-opened without restarting the application (issue #23)</w:t>
+            </w:r>
+          </w:p>
+        </w:tc>
+        <w:tc>
+          <w:tcPr>
+            <w:tcW w:type="dxa" w:w="1560"/>
+            <w:tcBorders>
+              <w:top w:val="single" w:color="C8CDD6" w:sz="1"/>
+              <w:left w:val="single" w:color="C8CDD6" w:sz="1"/>
+              <w:bottom w:val="single" w:color="C8CDD6" w:sz="1"/>
+              <w:right w:val="single" w:color="C8CDD6" w:sz="1"/>
+            </w:tcBorders>
+            <w:shd w:fill="F2F4F7" w:val="clear"/>
+            <w:tcMar>
+              <w:top w:type="dxa" w:w="70"/>
+              <w:left w:type="dxa" w:w="80"/>
+              <w:bottom w:type="dxa" w:w="70"/>
+              <w:right w:type="dxa" w:w="80"/>
+            </w:tcMar>
+          </w:tcPr>
+          <w:p>
+            <w:pPr>
+              <w:jc w:val="left"/>
+            </w:pPr>
+            <w:r>
+              <w:rPr>
+                <w:rFonts w:ascii="Arial" w:cs="Arial" w:eastAsia="Arial" w:hAnsi="Arial"/>
+                <w:b w:val="false"/>
+                <w:bCs w:val="false"/>
+                <w:color w:val="3C3C3C"/>
+                <w:sz w:val="18"/>
+                <w:szCs w:val="18"/>
+              </w:rPr>
+              <w:t xml:space="preserve">FRD PLAT-011</w:t>
+            </w:r>
+          </w:p>
+        </w:tc>
+        <w:tc>
+          <w:tcPr>
+            <w:tcW w:type="dxa" w:w="1400"/>
+            <w:tcBorders>
+              <w:top w:val="single" w:color="C8CDD6" w:sz="1"/>
+              <w:left w:val="single" w:color="C8CDD6" w:sz="1"/>
+              <w:bottom w:val="single" w:color="C8CDD6" w:sz="1"/>
+              <w:right w:val="single" w:color="C8CDD6" w:sz="1"/>
+            </w:tcBorders>
+            <w:shd w:fill="F2F4F7" w:val="clear"/>
+            <w:tcMar>
+              <w:top w:type="dxa" w:w="70"/>
+              <w:left w:type="dxa" w:w="100"/>
+              <w:bottom w:type="dxa" w:w="70"/>
+              <w:right w:type="dxa" w:w="80"/>
+            </w:tcMar>
+          </w:tcPr>
+          <w:p>
+            <w:pPr>
+              <w:jc w:val="left"/>
+            </w:pPr>
+            <w:r>
+              <w:rPr>
+                <w:rFonts w:ascii="Arial" w:cs="Arial" w:eastAsia="Arial" w:hAnsi="Arial"/>
+                <w:b w:val="false"/>
+                <w:bCs w:val="false"/>
+                <w:color w:val="3C3C3C"/>
+                <w:sz w:val="18"/>
+                <w:szCs w:val="18"/>
+              </w:rPr>
+              <w:t xml:space="preserve">C++ Eng #2</w:t>
+            </w:r>
+          </w:p>
+        </w:tc>
+        <w:tc>
+          <w:tcPr>
+            <w:tcW w:type="dxa" w:w="700"/>
+            <w:tcBorders>
+              <w:top w:val="single" w:color="C8CDD6" w:sz="1"/>
+              <w:left w:val="single" w:color="C8CDD6" w:sz="1"/>
+              <w:bottom w:val="single" w:color="C8CDD6" w:sz="1"/>
+              <w:right w:val="single" w:color="C8CDD6" w:sz="1"/>
+            </w:tcBorders>
+            <w:shd w:fill="D5F5D5" w:val="clear"/>
+            <w:tcMar>
+              <w:top w:type="dxa" w:w="70"/>
+              <w:left w:type="dxa" w:w="100"/>
+              <w:bottom w:type="dxa" w:w="70"/>
+              <w:right w:type="dxa" w:w="80"/>
+            </w:tcMar>
+            <w:vAlign w:val="center"/>
+          </w:tcPr>
+          <w:p>
+            <w:pPr>
+              <w:jc w:val="center"/>
+            </w:pPr>
+            <w:r>
+              <w:rPr>
+                <w:rFonts w:ascii="Arial" w:cs="Arial" w:eastAsia="Arial" w:hAnsi="Arial"/>
+                <w:b w:val="false"/>
+                <w:bCs w:val="false"/>
+                <w:color w:val="3C3C3C"/>
+                <w:sz w:val="18"/>
+                <w:szCs w:val="18"/>
+              </w:rPr>
+              <w:t xml:space="preserve">3</w:t>
+            </w:r>
+          </w:p>
+        </w:tc>
+        <w:tc>
+          <w:tcPr>
+            <w:tcW w:type="dxa" w:w="4700"/>
+            <w:tcBorders>
+              <w:top w:val="single" w:color="C8CDD6" w:sz="1"/>
+              <w:left w:val="single" w:color="C8CDD6" w:sz="1"/>
+              <w:bottom w:val="single" w:color="C8CDD6" w:sz="1"/>
+              <w:right w:val="single" w:color="C8CDD6" w:sz="1"/>
+            </w:tcBorders>
+            <w:shd w:fill="F2F4F7" w:val="clear"/>
+            <w:tcMar>
+              <w:top w:type="dxa" w:w="70"/>
+              <w:left w:type="dxa" w:w="100"/>
+              <w:bottom w:type="dxa" w:w="70"/>
+              <w:right w:type="dxa" w:w="80"/>
+            </w:tcMar>
+          </w:tcPr>
+          <w:p>
+            <w:pPr>
+              <w:jc w:val="left"/>
+            </w:pPr>
+            <w:r>
+              <w:rPr>
+                <w:rFonts w:ascii="Arial" w:cs="Arial" w:eastAsia="Arial" w:hAnsi="Arial"/>
+                <w:b w:val="false"/>
+                <w:bCs w:val="false"/>
+                <w:color w:val="3C3C3C"/>
+                <w:sz w:val="18"/>
+                <w:szCs w:val="18"/>
+              </w:rPr>
+              <w:t xml:space="preserve">All dock panels have a checkable View menu entry; toggling re-opens or closes the panel; checked state persists across restarts via QSettings</w:t>
+            </w:r>
+          </w:p>
+        </w:tc>
+      </w:tr>
+      <w:tr>
+        <w:tc>
+          <w:tcPr>
+            <w:tcW w:type="dxa" w:w="1000"/>
+            <w:tcBorders>
+              <w:top w:val="single" w:color="C8CDD6" w:sz="1"/>
+              <w:left w:val="single" w:color="C8CDD6" w:sz="1"/>
+              <w:bottom w:val="single" w:color="C8CDD6" w:sz="1"/>
+              <w:right w:val="single" w:color="C8CDD6" w:sz="1"/>
+            </w:tcBorders>
+            <w:shd w:fill="FFFFFF" w:val="clear"/>
+            <w:tcMar>
+              <w:top w:type="dxa" w:w="70"/>
+              <w:left w:type="dxa" w:w="100"/>
+              <w:bottom w:type="dxa" w:w="70"/>
+              <w:right w:type="dxa" w:w="80"/>
+            </w:tcMar>
+            <w:vAlign w:val="center"/>
+          </w:tcPr>
+          <w:p>
+            <w:pPr>
+              <w:jc w:val="center"/>
+            </w:pPr>
+            <w:r>
+              <w:rPr>
+                <w:rFonts w:ascii="Arial" w:cs="Arial" w:eastAsia="Arial" w:hAnsi="Arial"/>
+                <w:b/>
+                <w:bCs/>
+                <w:color w:val="1B2A4A"/>
+                <w:sz w:val="17"/>
+                <w:szCs w:val="17"/>
+              </w:rPr>
+              <w:t xml:space="preserve">3-2-9</w:t>
+            </w:r>
+          </w:p>
+        </w:tc>
+        <w:tc>
+          <w:tcPr>
+            <w:tcW w:type="dxa" w:w="3600"/>
+            <w:tcBorders>
+              <w:top w:val="single" w:color="C8CDD6" w:sz="1"/>
+              <w:left w:val="single" w:color="C8CDD6" w:sz="1"/>
+              <w:bottom w:val="single" w:color="C8CDD6" w:sz="1"/>
+              <w:right w:val="single" w:color="C8CDD6" w:sz="1"/>
+            </w:tcBorders>
+            <w:shd w:fill="FFFFFF" w:val="clear"/>
+            <w:tcMar>
+              <w:top w:type="dxa" w:w="70"/>
+              <w:left w:type="dxa" w:w="100"/>
+              <w:bottom w:type="dxa" w:w="70"/>
+              <w:right w:type="dxa" w:w="80"/>
+            </w:tcMar>
+          </w:tcPr>
+          <w:p>
+            <w:pPr>
+              <w:jc w:val="left"/>
+            </w:pPr>
+            <w:r>
+              <w:rPr>
+                <w:rFonts w:ascii="Arial" w:cs="Arial" w:eastAsia="Arial" w:hAnsi="Arial"/>
+                <w:b w:val="false"/>
+                <w:bCs w:val="false"/>
+                <w:color w:val="3C3C3C"/>
+                <w:sz w:val="18"/>
+                <w:szCs w:val="18"/>
+              </w:rPr>
+              <w:t xml:space="preserve">Save the active ClearanceRuleSet with the .arld project file and reload it on open; show ruleset name in status bar (issue #24)</w:t>
+            </w:r>
+          </w:p>
+        </w:tc>
+        <w:tc>
+          <w:tcPr>
+            <w:tcW w:type="dxa" w:w="1560"/>
+            <w:tcBorders>
+              <w:top w:val="single" w:color="C8CDD6" w:sz="1"/>
+              <w:left w:val="single" w:color="C8CDD6" w:sz="1"/>
+              <w:bottom w:val="single" w:color="C8CDD6" w:sz="1"/>
+              <w:right w:val="single" w:color="C8CDD6" w:sz="1"/>
+            </w:tcBorders>
+            <w:shd w:fill="FFFFFF" w:val="clear"/>
+            <w:tcMar>
+              <w:top w:type="dxa" w:w="70"/>
+              <w:left w:type="dxa" w:w="80"/>
+              <w:bottom w:type="dxa" w:w="70"/>
+              <w:right w:type="dxa" w:w="80"/>
+            </w:tcMar>
+          </w:tcPr>
+          <w:p>
+            <w:pPr>
+              <w:jc w:val="left"/>
+            </w:pPr>
+            <w:r>
+              <w:rPr>
+                <w:rFonts w:ascii="Arial" w:cs="Arial" w:eastAsia="Arial" w:hAnsi="Arial"/>
+                <w:b w:val="false"/>
+                <w:bCs w:val="false"/>
+                <w:color w:val="3C3C3C"/>
+                <w:sz w:val="18"/>
+                <w:szCs w:val="18"/>
+              </w:rPr>
+              <w:t xml:space="preserve">FRD RULES-015 / TRD-PERSIST-007</w:t>
+            </w:r>
+          </w:p>
+        </w:tc>
+        <w:tc>
+          <w:tcPr>
+            <w:tcW w:type="dxa" w:w="1400"/>
+            <w:tcBorders>
+              <w:top w:val="single" w:color="C8CDD6" w:sz="1"/>
+              <w:left w:val="single" w:color="C8CDD6" w:sz="1"/>
+              <w:bottom w:val="single" w:color="C8CDD6" w:sz="1"/>
+              <w:right w:val="single" w:color="C8CDD6" w:sz="1"/>
+            </w:tcBorders>
+            <w:shd w:fill="FFFFFF" w:val="clear"/>
+            <w:tcMar>
+              <w:top w:type="dxa" w:w="70"/>
+              <w:left w:type="dxa" w:w="100"/>
+              <w:bottom w:type="dxa" w:w="70"/>
+              <w:right w:type="dxa" w:w="80"/>
+            </w:tcMar>
+          </w:tcPr>
+          <w:p>
+            <w:pPr>
+              <w:jc w:val="left"/>
+            </w:pPr>
+            <w:r>
+              <w:rPr>
+                <w:rFonts w:ascii="Arial" w:cs="Arial" w:eastAsia="Arial" w:hAnsi="Arial"/>
+                <w:b w:val="false"/>
+                <w:bCs w:val="false"/>
+                <w:color w:val="3C3C3C"/>
+                <w:sz w:val="18"/>
+                <w:szCs w:val="18"/>
+              </w:rPr>
+              <w:t xml:space="preserve">Lead C++ Eng</w:t>
+            </w:r>
+          </w:p>
+        </w:tc>
+        <w:tc>
+          <w:tcPr>
+            <w:tcW w:type="dxa" w:w="700"/>
+            <w:tcBorders>
+              <w:top w:val="single" w:color="C8CDD6" w:sz="1"/>
+              <w:left w:val="single" w:color="C8CDD6" w:sz="1"/>
+              <w:bottom w:val="single" w:color="C8CDD6" w:sz="1"/>
+              <w:right w:val="single" w:color="C8CDD6" w:sz="1"/>
+            </w:tcBorders>
+            <w:shd w:fill="FFF3CD" w:val="clear"/>
+            <w:tcMar>
+              <w:top w:type="dxa" w:w="70"/>
+              <w:left w:type="dxa" w:w="100"/>
+              <w:bottom w:type="dxa" w:w="70"/>
+              <w:right w:type="dxa" w:w="80"/>
+            </w:tcMar>
+            <w:vAlign w:val="center"/>
+          </w:tcPr>
+          <w:p>
+            <w:pPr>
+              <w:jc w:val="center"/>
+            </w:pPr>
+            <w:r>
+              <w:rPr>
+                <w:rFonts w:ascii="Arial" w:cs="Arial" w:eastAsia="Arial" w:hAnsi="Arial"/>
+                <w:b w:val="false"/>
+                <w:bCs w:val="false"/>
+                <w:color w:val="3C3C3C"/>
+                <w:sz w:val="18"/>
+                <w:szCs w:val="18"/>
+              </w:rPr>
+              <w:t xml:space="preserve">8</w:t>
+            </w:r>
+          </w:p>
+        </w:tc>
+        <w:tc>
+          <w:tcPr>
+            <w:tcW w:type="dxa" w:w="4700"/>
+            <w:tcBorders>
+              <w:top w:val="single" w:color="C8CDD6" w:sz="1"/>
+              <w:left w:val="single" w:color="C8CDD6" w:sz="1"/>
+              <w:bottom w:val="single" w:color="C8CDD6" w:sz="1"/>
+              <w:right w:val="single" w:color="C8CDD6" w:sz="1"/>
+            </w:tcBorders>
+            <w:shd w:fill="FFFFFF" w:val="clear"/>
+            <w:tcMar>
+              <w:top w:type="dxa" w:w="70"/>
+              <w:left w:type="dxa" w:w="100"/>
+              <w:bottom w:type="dxa" w:w="70"/>
+              <w:right w:type="dxa" w:w="80"/>
+            </w:tcMar>
+          </w:tcPr>
+          <w:p>
+            <w:pPr>
+              <w:jc w:val="left"/>
+            </w:pPr>
+            <w:r>
+              <w:rPr>
+                <w:rFonts w:ascii="Arial" w:cs="Arial" w:eastAsia="Arial" w:hAnsi="Arial"/>
+                <w:b w:val="false"/>
+                <w:bCs w:val="false"/>
+                <w:color w:val="3C3C3C"/>
+                <w:sz w:val="18"/>
+                <w:szCs w:val="18"/>
+              </w:rPr>
+              <w:t xml:space="preserve">Round-trip: save project with custom rules, reopen, same rules active; status bar shows ruleset name; FAA CoW defaults applied when no rules present in file</w:t>
+            </w:r>
+          </w:p>
+        </w:tc>
+      </w:tr>
+    </w:tbl>
+    <w:p>
+      <w:pPr>
+        <w:spacing w:after="80" w:before="0"/>
+      </w:pPr>
+      <w:r>
+        <w:rPr>
+          <w:rFonts w:ascii="Arial" w:cs="Arial" w:eastAsia="Arial" w:hAnsi="Arial"/>
+        </w:rPr>
+        <w:t xml:space="preserve"/>
+      </w:r>
+    </w:p>
     <w:p>
       <w:pPr>
         <w:spacing w:after="80" w:before="0"/>
@@ -43133,7 +45428,7 @@
                 <w:sz w:val="24"/>
                 <w:szCs w:val="24"/>
               </w:rPr>
-              <w:t xml:space="preserve">Sprint 3-2</w:t>
+              <w:t xml:space="preserve">Sprint 3-3</w:t>
             </w:r>
           </w:p>
         </w:tc>
@@ -43180,7 +45475,7 @@
                 <w:sz w:val="18"/>
                 <w:szCs w:val="18"/>
               </w:rPr>
-              <w:t xml:space="preserve">Month 13–14, Wk 3–4</w:t>
+              <w:t xml:space="preserve">Month 14, Wk 1–4</w:t>
             </w:r>
           </w:p>
         </w:tc>
@@ -43530,7 +45825,7 @@
                 <w:sz w:val="17"/>
                 <w:szCs w:val="17"/>
               </w:rPr>
-              <w:t xml:space="preserve">3-2-1</w:t>
+              <w:t xml:space="preserve">3-3-1</w:t>
             </w:r>
           </w:p>
         </w:tc>
@@ -43738,7 +46033,7 @@
                 <w:sz w:val="17"/>
                 <w:szCs w:val="17"/>
               </w:rPr>
-              <w:t xml:space="preserve">3-2-2</w:t>
+              <w:t xml:space="preserve">3-3-2</w:t>
             </w:r>
           </w:p>
         </w:tc>
@@ -43946,7 +46241,7 @@
                 <w:sz w:val="17"/>
                 <w:szCs w:val="17"/>
               </w:rPr>
-              <w:t xml:space="preserve">3-2-3</w:t>
+              <w:t xml:space="preserve">3-3-3</w:t>
             </w:r>
           </w:p>
         </w:tc>
@@ -44154,7 +46449,7 @@
                 <w:sz w:val="17"/>
                 <w:szCs w:val="17"/>
               </w:rPr>
-              <w:t xml:space="preserve">3-2-4</w:t>
+              <w:t xml:space="preserve">3-3-4</w:t>
             </w:r>
           </w:p>
         </w:tc>
@@ -44362,7 +46657,7 @@
                 <w:sz w:val="17"/>
                 <w:szCs w:val="17"/>
               </w:rPr>
-              <w:t xml:space="preserve">3-2-5</w:t>
+              <w:t xml:space="preserve">3-3-5</w:t>
             </w:r>
           </w:p>
         </w:tc>
@@ -44570,7 +46865,7 @@
                 <w:sz w:val="17"/>
                 <w:szCs w:val="17"/>
               </w:rPr>
-              <w:t xml:space="preserve">3-2-6</w:t>
+              <w:t xml:space="preserve">3-3-6</w:t>
             </w:r>
           </w:p>
         </w:tc>
@@ -44778,7 +47073,7 @@
                 <w:sz w:val="17"/>
                 <w:szCs w:val="17"/>
               </w:rPr>
-              <w:t xml:space="preserve">3-2-7</w:t>
+              <w:t xml:space="preserve">3-3-7</w:t>
             </w:r>
           </w:p>
         </w:tc>
@@ -44986,7 +47281,7 @@
                 <w:sz w:val="17"/>
                 <w:szCs w:val="17"/>
               </w:rPr>
-              <w:t xml:space="preserve">3-2-8</w:t>
+              <w:t xml:space="preserve">3-3-8</w:t>
             </w:r>
           </w:p>
         </w:tc>
@@ -48461,7 +50756,7 @@
               <w:bottom w:val="single" w:color="C8CDD6" w:sz="1"/>
               <w:right w:val="single" w:color="C8CDD6" w:sz="1"/>
             </w:tcBorders>
-            <w:shd w:fill="FFFFFF" w:val="clear"/>
+            <w:shd w:fill="F2F4F7" w:val="clear"/>
             <w:tcMar>
               <w:top w:type="dxa" w:w="70"/>
               <w:left w:type="dxa" w:w="120"/>
@@ -48480,6 +50775,163 @@
                 <w:szCs w:val="18"/>
               </w:rPr>
               <w:t xml:space="preserve">Sprint 3-2</w:t>
+            </w:r>
+          </w:p>
+        </w:tc>
+        <w:tc>
+          <w:tcPr>
+            <w:tcW w:type="dxa" w:w="1800"/>
+            <w:tcBorders>
+              <w:top w:val="single" w:color="C8CDD6" w:sz="1"/>
+              <w:left w:val="single" w:color="C8CDD6" w:sz="1"/>
+              <w:bottom w:val="single" w:color="C8CDD6" w:sz="1"/>
+              <w:right w:val="single" w:color="C8CDD6" w:sz="1"/>
+            </w:tcBorders>
+            <w:shd w:fill="F2F4F7" w:val="clear"/>
+            <w:tcMar>
+              <w:top w:type="dxa" w:w="70"/>
+              <w:left w:type="dxa" w:w="120"/>
+              <w:bottom w:type="dxa" w:w="70"/>
+              <w:right w:type="dxa" w:w="100"/>
+            </w:tcMar>
+          </w:tcPr>
+          <w:p>
+            <w:pPr>
+              <w:jc w:val="center"/>
+            </w:pPr>
+            <w:r>
+              <w:rPr>
+                <w:rFonts w:ascii="Arial" w:cs="Arial" w:eastAsia="Arial" w:hAnsi="Arial"/>
+                <w:sz w:val="18"/>
+                <w:szCs w:val="18"/>
+              </w:rPr>
+              <w:t xml:space="preserve">38</w:t>
+            </w:r>
+          </w:p>
+        </w:tc>
+        <w:tc>
+          <w:tcPr>
+            <w:tcW w:type="dxa" w:w="1800"/>
+            <w:tcBorders>
+              <w:top w:val="single" w:color="C8CDD6" w:sz="1"/>
+              <w:left w:val="single" w:color="C8CDD6" w:sz="1"/>
+              <w:bottom w:val="single" w:color="C8CDD6" w:sz="1"/>
+              <w:right w:val="single" w:color="C8CDD6" w:sz="1"/>
+            </w:tcBorders>
+            <w:shd w:fill="F2F4F7" w:val="clear"/>
+            <w:tcMar>
+              <w:top w:type="dxa" w:w="70"/>
+              <w:left w:type="dxa" w:w="120"/>
+              <w:bottom w:type="dxa" w:w="70"/>
+              <w:right w:type="dxa" w:w="100"/>
+            </w:tcMar>
+          </w:tcPr>
+          <w:p>
+            <w:pPr>
+              <w:jc w:val="center"/>
+            </w:pPr>
+            <w:r>
+              <w:rPr>
+                <w:rFonts w:ascii="Arial" w:cs="Arial" w:eastAsia="Arial" w:hAnsi="Arial"/>
+                <w:sz w:val="18"/>
+                <w:szCs w:val="18"/>
+              </w:rPr>
+              <w:t xml:space="preserve">5.0 FTE</w:t>
+            </w:r>
+          </w:p>
+        </w:tc>
+        <w:tc>
+          <w:tcPr>
+            <w:tcW w:type="dxa" w:w="1800"/>
+            <w:tcBorders>
+              <w:top w:val="single" w:color="C8CDD6" w:sz="1"/>
+              <w:left w:val="single" w:color="C8CDD6" w:sz="1"/>
+              <w:bottom w:val="single" w:color="C8CDD6" w:sz="1"/>
+              <w:right w:val="single" w:color="C8CDD6" w:sz="1"/>
+            </w:tcBorders>
+            <w:shd w:fill="F2F4F7" w:val="clear"/>
+            <w:tcMar>
+              <w:top w:type="dxa" w:w="70"/>
+              <w:left w:type="dxa" w:w="120"/>
+              <w:bottom w:type="dxa" w:w="70"/>
+              <w:right w:type="dxa" w:w="100"/>
+            </w:tcMar>
+          </w:tcPr>
+          <w:p>
+            <w:pPr>
+              <w:jc w:val="center"/>
+            </w:pPr>
+            <w:r>
+              <w:rPr>
+                <w:rFonts w:ascii="Arial" w:cs="Arial" w:eastAsia="Arial" w:hAnsi="Arial"/>
+                <w:sz w:val="18"/>
+                <w:szCs w:val="18"/>
+              </w:rPr>
+              <w:t xml:space="preserve">38</w:t>
+            </w:r>
+          </w:p>
+        </w:tc>
+        <w:tc>
+          <w:tcPr>
+            <w:tcW w:type="dxa" w:w="4760"/>
+            <w:tcBorders>
+              <w:top w:val="single" w:color="C8CDD6" w:sz="1"/>
+              <w:left w:val="single" w:color="C8CDD6" w:sz="1"/>
+              <w:bottom w:val="single" w:color="C8CDD6" w:sz="1"/>
+              <w:right w:val="single" w:color="C8CDD6" w:sz="1"/>
+            </w:tcBorders>
+            <w:shd w:fill="F2F4F7" w:val="clear"/>
+            <w:tcMar>
+              <w:top w:type="dxa" w:w="70"/>
+              <w:left w:type="dxa" w:w="120"/>
+              <w:bottom w:type="dxa" w:w="70"/>
+              <w:right w:type="dxa" w:w="100"/>
+            </w:tcMar>
+          </w:tcPr>
+          <w:p>
+            <w:pPr>
+              <w:jc w:val="left"/>
+            </w:pPr>
+            <w:r>
+              <w:rPr>
+                <w:rFonts w:ascii="Arial" w:cs="Arial" w:eastAsia="Arial" w:hAnsi="Arial"/>
+                <w:sz w:val="18"/>
+                <w:szCs w:val="18"/>
+              </w:rPr>
+              <w:t xml:space="preserve">UAT bug fixes; rotation; satellite persistence; export menu; panel resize/re-open; custom clearance rules</w:t>
+            </w:r>
+          </w:p>
+        </w:tc>
+      </w:tr>
+      <w:tr>
+        <w:tc>
+          <w:tcPr>
+            <w:tcW w:type="dxa" w:w="2800"/>
+            <w:tcBorders>
+              <w:top w:val="single" w:color="C8CDD6" w:sz="1"/>
+              <w:left w:val="single" w:color="C8CDD6" w:sz="1"/>
+              <w:bottom w:val="single" w:color="C8CDD6" w:sz="1"/>
+              <w:right w:val="single" w:color="C8CDD6" w:sz="1"/>
+            </w:tcBorders>
+            <w:shd w:fill="FFFFFF" w:val="clear"/>
+            <w:tcMar>
+              <w:top w:type="dxa" w:w="70"/>
+              <w:left w:type="dxa" w:w="120"/>
+              <w:bottom w:type="dxa" w:w="70"/>
+              <w:right w:type="dxa" w:w="100"/>
+            </w:tcMar>
+          </w:tcPr>
+          <w:p>
+            <w:pPr>
+              <w:jc w:val="left"/>
+            </w:pPr>
+            <w:r>
+              <w:rPr>
+                <w:rFonts w:ascii="Arial" w:cs="Arial" w:eastAsia="Arial" w:hAnsi="Arial"/>
+                <w:sz w:val="18"/>
+                <w:szCs w:val="18"/>
+              </w:rPr>
+              <w:t xml:space="preserve">Sprint 3-3</w:t>
             </w:r>
           </w:p>
         </w:tc>
@@ -49243,7 +51695,7 @@
                 <w:sz w:val="19"/>
                 <w:szCs w:val="19"/>
               </w:rPr>
-              <w:t xml:space="preserve">2</w:t>
+              <w:t xml:space="preserve">3</w:t>
             </w:r>
           </w:p>
         </w:tc>
@@ -49276,7 +51728,7 @@
                 <w:sz w:val="19"/>
                 <w:szCs w:val="19"/>
               </w:rPr>
-              <w:t xml:space="preserve">78</w:t>
+              <w:t xml:space="preserve">116</w:t>
             </w:r>
           </w:p>
         </w:tc>
@@ -49377,7 +51829,7 @@
                 <w:sz w:val="19"/>
                 <w:szCs w:val="19"/>
               </w:rPr>
-              <w:t xml:space="preserve">19</w:t>
+              <w:t xml:space="preserve">20</w:t>
             </w:r>
           </w:p>
         </w:tc>
@@ -49410,7 +51862,7 @@
                 <w:sz w:val="19"/>
                 <w:szCs w:val="19"/>
               </w:rPr>
-              <w:t xml:space="preserve">789</w:t>
+              <w:t xml:space="preserve">827</w:t>
             </w:r>
           </w:p>
         </w:tc>

</xml_diff>